<commit_message>
Remove SQLite/Excel-as-source, fix duplicate Snowflake auth on startup
- Delete unused config.py (EXCEL_FILE, DB_PATH never imported)
- Remove load_from_excel(), Excel data source branch, /api/browse_excel endpoint
- Guard startup init with WERKZEUG_RUN_MAIN to prevent double auth in debug mode
- Update config.example.json, DATA_SOURCES.md, README.md for Snowflake-only

Co-Authored-By: Claude Opus 4.6 <noreply@anthropic.com>
</commit_message>
<xml_diff>
--- a/Things to consider.docx
+++ b/Things to consider.docx
@@ -4,6 +4,362 @@
   <w:body>
     <w:p>
       <w:pPr>
+        <w:ind w:left="720" w:hanging="360"/>
+      </w:pPr>
+      <w:r>
+        <w:t>What is good enough for MVP, without bells and whistles.</w:t>
+      </w:r>
+    </w:p>
+    <w:p>
+      <w:pPr>
+        <w:pStyle w:val="NoSpacing"/>
+        <w:numPr>
+          <w:ilvl w:val="0"/>
+          <w:numId w:val="13"/>
+        </w:numPr>
+      </w:pPr>
+      <w:r>
+        <w:t>Start with Staging (is this BA master or something else)</w:t>
+      </w:r>
+      <w:r>
+        <w:t>.</w:t>
+      </w:r>
+    </w:p>
+    <w:p>
+      <w:pPr>
+        <w:pStyle w:val="NoSpacing"/>
+        <w:numPr>
+          <w:ilvl w:val="0"/>
+          <w:numId w:val="13"/>
+        </w:numPr>
+      </w:pPr>
+      <w:r>
+        <w:t xml:space="preserve">Work with client </w:t>
+      </w:r>
+      <w:r>
+        <w:t>to load source, give template</w:t>
+      </w:r>
+      <w:r>
+        <w:t>.</w:t>
+      </w:r>
+    </w:p>
+    <w:p>
+      <w:pPr>
+        <w:pStyle w:val="NoSpacing"/>
+        <w:numPr>
+          <w:ilvl w:val="0"/>
+          <w:numId w:val="13"/>
+        </w:numPr>
+      </w:pPr>
+      <w:r>
+        <w:t xml:space="preserve">Think about how delta data works, on new </w:t>
+      </w:r>
+      <w:proofErr w:type="spellStart"/>
+      <w:r>
+        <w:t>datasources</w:t>
+      </w:r>
+      <w:proofErr w:type="spellEnd"/>
+      <w:r>
+        <w:t>.</w:t>
+      </w:r>
+    </w:p>
+    <w:p>
+      <w:pPr>
+        <w:pStyle w:val="NoSpacing"/>
+        <w:numPr>
+          <w:ilvl w:val="0"/>
+          <w:numId w:val="13"/>
+        </w:numPr>
+      </w:pPr>
+      <w:r>
+        <w:t>Meet with Steve on MVP</w:t>
+      </w:r>
+      <w:r>
+        <w:t>.</w:t>
+      </w:r>
+    </w:p>
+    <w:p>
+      <w:pPr>
+        <w:pStyle w:val="NoSpacing"/>
+        <w:numPr>
+          <w:ilvl w:val="0"/>
+          <w:numId w:val="13"/>
+        </w:numPr>
+      </w:pPr>
+      <w:r>
+        <w:t>If same address then use newest seq number</w:t>
+      </w:r>
+      <w:r>
+        <w:t>.</w:t>
+      </w:r>
+    </w:p>
+    <w:p>
+      <w:pPr>
+        <w:pStyle w:val="NoSpacing"/>
+        <w:numPr>
+          <w:ilvl w:val="0"/>
+          <w:numId w:val="13"/>
+        </w:numPr>
+      </w:pPr>
+      <w:r>
+        <w:t>Undo on changes (?)</w:t>
+      </w:r>
+      <w:r>
+        <w:t xml:space="preserve"> or just report</w:t>
+      </w:r>
+      <w:r>
+        <w:t>.</w:t>
+      </w:r>
+    </w:p>
+    <w:p>
+      <w:pPr>
+        <w:pStyle w:val="NoSpacing"/>
+        <w:numPr>
+          <w:ilvl w:val="0"/>
+          <w:numId w:val="13"/>
+        </w:numPr>
+      </w:pPr>
+      <w:r>
+        <w:t>Allow changes on source for new addresses</w:t>
+      </w:r>
+    </w:p>
+    <w:p>
+      <w:pPr>
+        <w:pStyle w:val="NoSpacing"/>
+        <w:numPr>
+          <w:ilvl w:val="0"/>
+          <w:numId w:val="13"/>
+        </w:numPr>
+      </w:pPr>
+      <w:r>
+        <w:t>Allow moves from bucket to bucket after saves</w:t>
+      </w:r>
+    </w:p>
+    <w:p>
+      <w:pPr>
+        <w:pStyle w:val="NoSpacing"/>
+        <w:numPr>
+          <w:ilvl w:val="0"/>
+          <w:numId w:val="13"/>
+        </w:numPr>
+      </w:pPr>
+      <w:r>
+        <w:t xml:space="preserve">Submit for UAT/Live button.  How does this trigger the process to write to </w:t>
+      </w:r>
+      <w:proofErr w:type="spellStart"/>
+      <w:r>
+        <w:t>Enertia</w:t>
+      </w:r>
+      <w:proofErr w:type="spellEnd"/>
+      <w:r>
+        <w:t xml:space="preserve"> or </w:t>
+      </w:r>
+      <w:r>
+        <w:t>t</w:t>
+      </w:r>
+      <w:r>
+        <w:t>emplate table(s)</w:t>
+      </w:r>
+    </w:p>
+    <w:p>
+      <w:pPr>
+        <w:pStyle w:val="NoSpacing"/>
+        <w:numPr>
+          <w:ilvl w:val="0"/>
+          <w:numId w:val="13"/>
+        </w:numPr>
+      </w:pPr>
+      <w:r>
+        <w:t>To Rerun do we truncate and re-run everything.</w:t>
+      </w:r>
+    </w:p>
+    <w:p>
+      <w:pPr>
+        <w:pStyle w:val="NoSpacing"/>
+        <w:numPr>
+          <w:ilvl w:val="0"/>
+          <w:numId w:val="13"/>
+        </w:numPr>
+      </w:pPr>
+      <w:r>
+        <w:t xml:space="preserve">Login(s).  Multiple users should be allowed and last update wins. </w:t>
+      </w:r>
+      <w:r>
+        <w:t xml:space="preserve"> Push notifications, etc.  Assign records to approve by bucket?</w:t>
+      </w:r>
+    </w:p>
+    <w:p>
+      <w:pPr>
+        <w:pStyle w:val="NoSpacing"/>
+        <w:numPr>
+          <w:ilvl w:val="0"/>
+          <w:numId w:val="13"/>
+        </w:numPr>
+      </w:pPr>
+      <w:r>
+        <w:t>Where do we deploy for use (Julio).</w:t>
+      </w:r>
+    </w:p>
+    <w:p>
+      <w:pPr>
+        <w:pStyle w:val="NoSpacing"/>
+        <w:numPr>
+          <w:ilvl w:val="0"/>
+          <w:numId w:val="13"/>
+        </w:numPr>
+      </w:pPr>
+      <w:r>
+        <w:t>Make sure when a new BA with multiple addresses is added that the BA is only added once.</w:t>
+      </w:r>
+    </w:p>
+    <w:p>
+      <w:pPr>
+        <w:pStyle w:val="NoSpacing"/>
+        <w:numPr>
+          <w:ilvl w:val="0"/>
+          <w:numId w:val="13"/>
+        </w:numPr>
+      </w:pPr>
+    </w:p>
+    <w:p>
+      <w:pPr>
+        <w:pStyle w:val="NoSpacing"/>
+      </w:pPr>
+    </w:p>
+    <w:p>
+      <w:pPr>
+        <w:pStyle w:val="NoSpacing"/>
+      </w:pPr>
+    </w:p>
+    <w:p>
+      <w:pPr>
+        <w:pStyle w:val="NoSpacing"/>
+      </w:pPr>
+      <w:r>
+        <w:t>Street address goes on 1</w:t>
+      </w:r>
+      <w:r>
+        <w:rPr>
+          <w:vertAlign w:val="superscript"/>
+        </w:rPr>
+        <w:t>st</w:t>
+      </w:r>
+      <w:r>
+        <w:t xml:space="preserve"> line. 3 total lines of 45 characters.</w:t>
+      </w:r>
+    </w:p>
+    <w:p>
+      <w:pPr>
+        <w:pStyle w:val="NoSpacing"/>
+      </w:pPr>
+      <w:r>
+        <w:t xml:space="preserve">Use </w:t>
+      </w:r>
+      <w:proofErr w:type="spellStart"/>
+      <w:r>
+        <w:t>Addr</w:t>
+      </w:r>
+      <w:proofErr w:type="spellEnd"/>
+      <w:r>
+        <w:t xml:space="preserve"> Normal to deconstruct the address.  Then place 1</w:t>
+      </w:r>
+      <w:r>
+        <w:rPr>
+          <w:vertAlign w:val="superscript"/>
+        </w:rPr>
+        <w:t>st</w:t>
+      </w:r>
+      <w:r>
+        <w:t xml:space="preserve"> line, then subtract from the original address, then 2</w:t>
+      </w:r>
+      <w:r>
+        <w:rPr>
+          <w:vertAlign w:val="superscript"/>
+        </w:rPr>
+        <w:t>nd</w:t>
+      </w:r>
+      <w:r>
+        <w:t xml:space="preserve"> line to 3</w:t>
+      </w:r>
+      <w:r>
+        <w:rPr>
+          <w:vertAlign w:val="superscript"/>
+        </w:rPr>
+        <w:t>rd</w:t>
+      </w:r>
+      <w:r>
+        <w:t xml:space="preserve"> (or 4</w:t>
+      </w:r>
+      <w:r>
+        <w:rPr>
+          <w:vertAlign w:val="superscript"/>
+        </w:rPr>
+        <w:t>th</w:t>
+      </w:r>
+      <w:r>
+        <w:t>) gets 45 chars.</w:t>
+      </w:r>
+    </w:p>
+    <w:p>
+      <w:pPr>
+        <w:pStyle w:val="NoSpacing"/>
+      </w:pPr>
+      <w:r>
+        <w:rPr>
+          <w:noProof/>
+        </w:rPr>
+        <w:drawing>
+          <wp:inline distT="0" distB="0" distL="0" distR="0" wp14:anchorId="6A8A5844" wp14:editId="3E0A2F84">
+            <wp:extent cx="5943600" cy="1577340"/>
+            <wp:effectExtent l="0" t="0" r="0" b="3810"/>
+            <wp:docPr id="87977741" name="Picture 1"/>
+            <wp:cNvGraphicFramePr>
+              <a:graphicFrameLocks xmlns:a="http://schemas.openxmlformats.org/drawingml/2006/main" noChangeAspect="1"/>
+            </wp:cNvGraphicFramePr>
+            <a:graphic xmlns:a="http://schemas.openxmlformats.org/drawingml/2006/main">
+              <a:graphicData uri="http://schemas.openxmlformats.org/drawingml/2006/picture">
+                <pic:pic xmlns:pic="http://schemas.openxmlformats.org/drawingml/2006/picture">
+                  <pic:nvPicPr>
+                    <pic:cNvPr id="87977741" name=""/>
+                    <pic:cNvPicPr/>
+                  </pic:nvPicPr>
+                  <pic:blipFill>
+                    <a:blip r:embed="rId5"/>
+                    <a:stretch>
+                      <a:fillRect/>
+                    </a:stretch>
+                  </pic:blipFill>
+                  <pic:spPr>
+                    <a:xfrm>
+                      <a:off x="0" y="0"/>
+                      <a:ext cx="5943600" cy="1577340"/>
+                    </a:xfrm>
+                    <a:prstGeom prst="rect">
+                      <a:avLst/>
+                    </a:prstGeom>
+                  </pic:spPr>
+                </pic:pic>
+              </a:graphicData>
+            </a:graphic>
+          </wp:inline>
+        </w:drawing>
+      </w:r>
+    </w:p>
+    <w:p>
+      <w:pPr>
+        <w:pStyle w:val="NoSpacing"/>
+      </w:pPr>
+      <w:r>
+        <w:t>Implement merging of datafiles</w:t>
+      </w:r>
+    </w:p>
+    <w:p>
+      <w:pPr>
+        <w:pStyle w:val="NoSpacing"/>
+      </w:pPr>
+    </w:p>
+    <w:p>
+      <w:pPr>
         <w:pStyle w:val="NoSpacing"/>
       </w:pPr>
       <w:r>
@@ -23,6 +379,9 @@
         <w:pStyle w:val="NoSpacing"/>
       </w:pPr>
       <w:r>
+        <w:rPr>
+          <w:noProof/>
+        </w:rPr>
         <w:drawing>
           <wp:inline distT="0" distB="0" distL="0" distR="0" wp14:anchorId="1A655340" wp14:editId="4F90B483">
             <wp:extent cx="5943600" cy="69215"/>
@@ -39,7 +398,7 @@
                     <pic:cNvPicPr/>
                   </pic:nvPicPr>
                   <pic:blipFill>
-                    <a:blip r:embed="rId5"/>
+                    <a:blip r:embed="rId6"/>
                     <a:stretch>
                       <a:fillRect/>
                     </a:stretch>
@@ -65,6 +424,9 @@
         <w:pStyle w:val="NoSpacing"/>
       </w:pPr>
       <w:r>
+        <w:rPr>
+          <w:noProof/>
+        </w:rPr>
         <w:drawing>
           <wp:inline distT="0" distB="0" distL="0" distR="0" wp14:anchorId="732AF76F" wp14:editId="5E3C4EEE">
             <wp:extent cx="5943600" cy="71120"/>
@@ -81,7 +443,7 @@
                     <pic:cNvPicPr/>
                   </pic:nvPicPr>
                   <pic:blipFill>
-                    <a:blip r:embed="rId6"/>
+                    <a:blip r:embed="rId7"/>
                     <a:stretch>
                       <a:fillRect/>
                     </a:stretch>
@@ -107,6 +469,9 @@
         <w:pStyle w:val="NoSpacing"/>
       </w:pPr>
       <w:r>
+        <w:rPr>
+          <w:noProof/>
+        </w:rPr>
         <w:drawing>
           <wp:inline distT="0" distB="0" distL="0" distR="0" wp14:anchorId="467EC6A8" wp14:editId="1D872342">
             <wp:extent cx="5943600" cy="83185"/>
@@ -123,7 +488,7 @@
                     <pic:cNvPicPr/>
                   </pic:nvPicPr>
                   <pic:blipFill>
-                    <a:blip r:embed="rId7"/>
+                    <a:blip r:embed="rId8"/>
                     <a:stretch>
                       <a:fillRect/>
                     </a:stretch>
@@ -149,6 +514,9 @@
         <w:pStyle w:val="NoSpacing"/>
       </w:pPr>
       <w:r>
+        <w:rPr>
+          <w:noProof/>
+        </w:rPr>
         <w:drawing>
           <wp:inline distT="0" distB="0" distL="0" distR="0" wp14:anchorId="4A086DCF" wp14:editId="6263C687">
             <wp:extent cx="5943600" cy="72390"/>
@@ -165,7 +533,7 @@
                     <pic:cNvPicPr/>
                   </pic:nvPicPr>
                   <pic:blipFill>
-                    <a:blip r:embed="rId8"/>
+                    <a:blip r:embed="rId9"/>
                     <a:stretch>
                       <a:fillRect/>
                     </a:stretch>
@@ -191,6 +559,9 @@
         <w:pStyle w:val="NoSpacing"/>
       </w:pPr>
       <w:r>
+        <w:rPr>
+          <w:noProof/>
+        </w:rPr>
         <w:drawing>
           <wp:inline distT="0" distB="0" distL="0" distR="0" wp14:anchorId="2C6929F3" wp14:editId="0AC46FD4">
             <wp:extent cx="5943600" cy="66675"/>
@@ -207,7 +578,7 @@
                     <pic:cNvPicPr/>
                   </pic:nvPicPr>
                   <pic:blipFill>
-                    <a:blip r:embed="rId9"/>
+                    <a:blip r:embed="rId10"/>
                     <a:stretch>
                       <a:fillRect/>
                     </a:stretch>
@@ -233,6 +604,9 @@
         <w:pStyle w:val="NoSpacing"/>
       </w:pPr>
       <w:r>
+        <w:rPr>
+          <w:noProof/>
+        </w:rPr>
         <w:drawing>
           <wp:inline distT="0" distB="0" distL="0" distR="0" wp14:anchorId="66DE328F" wp14:editId="33BAA4ED">
             <wp:extent cx="5943600" cy="71755"/>
@@ -249,7 +623,7 @@
                     <pic:cNvPicPr/>
                   </pic:nvPicPr>
                   <pic:blipFill>
-                    <a:blip r:embed="rId10"/>
+                    <a:blip r:embed="rId11"/>
                     <a:stretch>
                       <a:fillRect/>
                     </a:stretch>
@@ -275,6 +649,9 @@
         <w:pStyle w:val="NoSpacing"/>
       </w:pPr>
       <w:r>
+        <w:rPr>
+          <w:noProof/>
+        </w:rPr>
         <w:drawing>
           <wp:inline distT="0" distB="0" distL="0" distR="0" wp14:anchorId="0DB38BCC" wp14:editId="641AFB4F">
             <wp:extent cx="5943600" cy="65405"/>
@@ -291,7 +668,7 @@
                     <pic:cNvPicPr/>
                   </pic:nvPicPr>
                   <pic:blipFill>
-                    <a:blip r:embed="rId11"/>
+                    <a:blip r:embed="rId12"/>
                     <a:stretch>
                       <a:fillRect/>
                     </a:stretch>
@@ -317,6 +694,9 @@
         <w:pStyle w:val="NoSpacing"/>
       </w:pPr>
       <w:r>
+        <w:rPr>
+          <w:noProof/>
+        </w:rPr>
         <w:drawing>
           <wp:inline distT="0" distB="0" distL="0" distR="0" wp14:anchorId="53270DF0" wp14:editId="62BCCAA6">
             <wp:extent cx="5943600" cy="74295"/>
@@ -333,7 +713,7 @@
                     <pic:cNvPicPr/>
                   </pic:nvPicPr>
                   <pic:blipFill>
-                    <a:blip r:embed="rId12"/>
+                    <a:blip r:embed="rId13"/>
                     <a:stretch>
                       <a:fillRect/>
                     </a:stretch>
@@ -359,6 +739,9 @@
         <w:pStyle w:val="NoSpacing"/>
       </w:pPr>
       <w:r>
+        <w:rPr>
+          <w:noProof/>
+        </w:rPr>
         <w:drawing>
           <wp:inline distT="0" distB="0" distL="0" distR="0" wp14:anchorId="4F89042E" wp14:editId="6856B48A">
             <wp:extent cx="5943600" cy="81280"/>
@@ -375,7 +758,7 @@
                     <pic:cNvPicPr/>
                   </pic:nvPicPr>
                   <pic:blipFill>
-                    <a:blip r:embed="rId13"/>
+                    <a:blip r:embed="rId14"/>
                     <a:stretch>
                       <a:fillRect/>
                     </a:stretch>
@@ -401,6 +784,10 @@
         <w:pStyle w:val="NoSpacing"/>
       </w:pPr>
       <w:r>
+        <w:rPr>
+          <w:noProof/>
+        </w:rPr>
+        <w:lastRenderedPageBreak/>
         <w:drawing>
           <wp:inline distT="0" distB="0" distL="0" distR="0" wp14:anchorId="36C45559" wp14:editId="375879EF">
             <wp:extent cx="5943600" cy="81915"/>
@@ -417,7 +804,7 @@
                     <pic:cNvPicPr/>
                   </pic:nvPicPr>
                   <pic:blipFill>
-                    <a:blip r:embed="rId14"/>
+                    <a:blip r:embed="rId15"/>
                     <a:stretch>
                       <a:fillRect/>
                     </a:stretch>
@@ -443,6 +830,9 @@
         <w:pStyle w:val="NoSpacing"/>
       </w:pPr>
       <w:r>
+        <w:rPr>
+          <w:noProof/>
+        </w:rPr>
         <w:drawing>
           <wp:inline distT="0" distB="0" distL="0" distR="0" wp14:anchorId="7B90EAFF" wp14:editId="3ED795F8">
             <wp:extent cx="5943600" cy="77470"/>
@@ -459,7 +849,7 @@
                     <pic:cNvPicPr/>
                   </pic:nvPicPr>
                   <pic:blipFill>
-                    <a:blip r:embed="rId15"/>
+                    <a:blip r:embed="rId16"/>
                     <a:stretch>
                       <a:fillRect/>
                     </a:stretch>
@@ -495,6 +885,9 @@
         <w:pStyle w:val="NoSpacing"/>
       </w:pPr>
       <w:r>
+        <w:rPr>
+          <w:noProof/>
+        </w:rPr>
         <w:drawing>
           <wp:inline distT="0" distB="0" distL="0" distR="0" wp14:anchorId="28646C6A" wp14:editId="4AB0E51A">
             <wp:extent cx="5943600" cy="94615"/>
@@ -511,7 +904,7 @@
                     <pic:cNvPicPr/>
                   </pic:nvPicPr>
                   <pic:blipFill>
-                    <a:blip r:embed="rId16"/>
+                    <a:blip r:embed="rId17"/>
                     <a:stretch>
                       <a:fillRect/>
                     </a:stretch>
@@ -555,6 +948,9 @@
         <w:pStyle w:val="NoSpacing"/>
       </w:pPr>
       <w:r>
+        <w:rPr>
+          <w:noProof/>
+        </w:rPr>
         <w:drawing>
           <wp:inline distT="0" distB="0" distL="0" distR="0" wp14:anchorId="3AEBE4AF" wp14:editId="26D567ED">
             <wp:extent cx="5943600" cy="128905"/>
@@ -571,7 +967,7 @@
                     <pic:cNvPicPr/>
                   </pic:nvPicPr>
                   <pic:blipFill>
-                    <a:blip r:embed="rId17"/>
+                    <a:blip r:embed="rId18"/>
                     <a:stretch>
                       <a:fillRect/>
                     </a:stretch>
@@ -615,6 +1011,9 @@
         <w:pStyle w:val="NoSpacing"/>
       </w:pPr>
       <w:r>
+        <w:rPr>
+          <w:noProof/>
+        </w:rPr>
         <w:drawing>
           <wp:inline distT="0" distB="0" distL="0" distR="0" wp14:anchorId="4E5EF15F" wp14:editId="0FCCC444">
             <wp:extent cx="5943600" cy="104775"/>
@@ -631,7 +1030,7 @@
                     <pic:cNvPicPr/>
                   </pic:nvPicPr>
                   <pic:blipFill>
-                    <a:blip r:embed="rId18"/>
+                    <a:blip r:embed="rId19"/>
                     <a:stretch>
                       <a:fillRect/>
                     </a:stretch>
@@ -674,20 +1073,18 @@
       <w:pPr>
         <w:pStyle w:val="NoSpacing"/>
       </w:pPr>
-      <w:proofErr w:type="gramStart"/>
-      <w:r>
-        <w:t>At 100</w:t>
-      </w:r>
-      <w:proofErr w:type="gramEnd"/>
-      <w:r>
-        <w:t>% accuracy:</w:t>
-      </w:r>
-    </w:p>
-    <w:p>
-      <w:pPr>
-        <w:pStyle w:val="NoSpacing"/>
-      </w:pPr>
-      <w:r>
+      <w:r>
+        <w:t>At 100% accuracy:</w:t>
+      </w:r>
+    </w:p>
+    <w:p>
+      <w:pPr>
+        <w:pStyle w:val="NoSpacing"/>
+      </w:pPr>
+      <w:r>
+        <w:rPr>
+          <w:noProof/>
+        </w:rPr>
         <w:drawing>
           <wp:inline distT="0" distB="0" distL="0" distR="0" wp14:anchorId="3AFBD9E3" wp14:editId="7201FA68">
             <wp:extent cx="5943600" cy="165100"/>
@@ -704,7 +1101,7 @@
                     <pic:cNvPicPr/>
                   </pic:nvPicPr>
                   <pic:blipFill>
-                    <a:blip r:embed="rId19"/>
+                    <a:blip r:embed="rId20"/>
                     <a:stretch>
                       <a:fillRect/>
                     </a:stretch>
@@ -745,15 +1142,7 @@
         <w:pStyle w:val="NoSpacing"/>
       </w:pPr>
       <w:r>
-        <w:t xml:space="preserve">May need a new bucket or status or column that states all numbers in address match AND city, state, zip match, which I would think would let the user make changes based on this.  </w:t>
-      </w:r>
-      <w:proofErr w:type="gramStart"/>
-      <w:r>
-        <w:t>But</w:t>
-      </w:r>
-      <w:proofErr w:type="gramEnd"/>
-      <w:r>
-        <w:t xml:space="preserve"> need to look at why the 0 match.   </w:t>
+        <w:t xml:space="preserve">May need a new bucket or status or column that states all numbers in address match AND city, state, zip match, which I would think would let the user make changes based on this.  But need to look at why the 0 match.   </w:t>
       </w:r>
     </w:p>
     <w:p>
@@ -807,80 +1196,80 @@
         </w:numPr>
       </w:pPr>
       <w:r>
+        <w:t>Allow mapping to itself for dedupe of entire dataset.  Need to be smart about the blocking and marking items sent to API (smarty streets, etc.) so not to send more than once.</w:t>
+      </w:r>
+    </w:p>
+    <w:p>
+      <w:pPr>
+        <w:pStyle w:val="NoSpacing"/>
+      </w:pPr>
+    </w:p>
+    <w:p>
+      <w:pPr>
+        <w:pStyle w:val="NoSpacing"/>
+      </w:pPr>
+    </w:p>
+    <w:p>
+      <w:pPr>
+        <w:pStyle w:val="NoSpacing"/>
+      </w:pPr>
+      <w:r>
+        <w:t>********************************************************</w:t>
+      </w:r>
+    </w:p>
+    <w:p>
+      <w:pPr>
+        <w:pStyle w:val="NoSpacing"/>
+      </w:pPr>
+    </w:p>
+    <w:p>
+      <w:pPr>
+        <w:pStyle w:val="NoSpacing"/>
+      </w:pPr>
+      <w:r>
+        <w:t xml:space="preserve">Would adding this is a </w:t>
+      </w:r>
+      <w:proofErr w:type="spellStart"/>
+      <w:r>
+        <w:t>corp</w:t>
+      </w:r>
+      <w:proofErr w:type="spellEnd"/>
+      <w:r>
+        <w:t xml:space="preserve"> help?  </w:t>
+      </w:r>
+    </w:p>
+    <w:p>
+      <w:pPr>
+        <w:pStyle w:val="NoSpacing"/>
+      </w:pPr>
+    </w:p>
+    <w:p>
+      <w:pPr>
+        <w:pStyle w:val="NoSpacing"/>
+      </w:pPr>
+    </w:p>
+    <w:p>
+      <w:pPr>
+        <w:pStyle w:val="NoSpacing"/>
+      </w:pPr>
+      <w:r>
+        <w:t xml:space="preserve">******* </w:t>
+      </w:r>
+      <w:r>
+        <w:t>Can you kill any zombie processes and restart app.py</w:t>
+      </w:r>
+    </w:p>
+    <w:p>
+      <w:pPr>
+        <w:pStyle w:val="NoSpacing"/>
+      </w:pPr>
+    </w:p>
+    <w:p>
+      <w:pPr>
+        <w:pStyle w:val="NoSpacing"/>
+      </w:pPr>
+      <w:r>
         <w:lastRenderedPageBreak/>
-        <w:t>Allow mapping to itself for dedupe of entire dataset.  Need to be smart about the blocking and marking items sent to API (smarty streets, etc.) so not to send more than once.</w:t>
-      </w:r>
-    </w:p>
-    <w:p>
-      <w:pPr>
-        <w:pStyle w:val="NoSpacing"/>
-      </w:pPr>
-    </w:p>
-    <w:p>
-      <w:pPr>
-        <w:pStyle w:val="NoSpacing"/>
-      </w:pPr>
-    </w:p>
-    <w:p>
-      <w:pPr>
-        <w:pStyle w:val="NoSpacing"/>
-      </w:pPr>
-      <w:r>
-        <w:t>********************************************************</w:t>
-      </w:r>
-    </w:p>
-    <w:p>
-      <w:pPr>
-        <w:pStyle w:val="NoSpacing"/>
-      </w:pPr>
-    </w:p>
-    <w:p>
-      <w:pPr>
-        <w:pStyle w:val="NoSpacing"/>
-      </w:pPr>
-      <w:r>
-        <w:t xml:space="preserve">Would adding this is a </w:t>
-      </w:r>
-      <w:proofErr w:type="spellStart"/>
-      <w:r>
-        <w:t>corp</w:t>
-      </w:r>
-      <w:proofErr w:type="spellEnd"/>
-      <w:r>
-        <w:t xml:space="preserve"> help?  </w:t>
-      </w:r>
-    </w:p>
-    <w:p>
-      <w:pPr>
-        <w:pStyle w:val="NoSpacing"/>
-      </w:pPr>
-    </w:p>
-    <w:p>
-      <w:pPr>
-        <w:pStyle w:val="NoSpacing"/>
-      </w:pPr>
-    </w:p>
-    <w:p>
-      <w:pPr>
-        <w:pStyle w:val="NoSpacing"/>
-      </w:pPr>
-      <w:r>
-        <w:t xml:space="preserve">******* </w:t>
-      </w:r>
-      <w:r>
-        <w:t>Can you kill any zombie processes and restart app.py</w:t>
-      </w:r>
-    </w:p>
-    <w:p>
-      <w:pPr>
-        <w:pStyle w:val="NoSpacing"/>
-      </w:pPr>
-    </w:p>
-    <w:p>
-      <w:pPr>
-        <w:pStyle w:val="NoSpacing"/>
-      </w:pPr>
-      <w:r>
         <w:t>API access:</w:t>
       </w:r>
     </w:p>
@@ -908,7 +1297,7 @@
                     <pic:cNvPicPr/>
                   </pic:nvPicPr>
                   <pic:blipFill>
-                    <a:blip r:embed="rId20"/>
+                    <a:blip r:embed="rId21"/>
                     <a:stretch>
                       <a:fillRect/>
                     </a:stretch>
@@ -952,15 +1341,7 @@
       </w:r>
       <w:proofErr w:type="spellEnd"/>
       <w:r>
-        <w:t xml:space="preserve"> score is low and name is </w:t>
-      </w:r>
-      <w:proofErr w:type="gramStart"/>
-      <w:r>
-        <w:t>fairly high</w:t>
-      </w:r>
-      <w:proofErr w:type="gramEnd"/>
-      <w:r>
-        <w:t xml:space="preserve"> and </w:t>
+        <w:t xml:space="preserve"> score is low and name is fairly high and </w:t>
       </w:r>
       <w:proofErr w:type="spellStart"/>
       <w:r>
@@ -968,15 +1349,7 @@
       </w:r>
       <w:proofErr w:type="spellEnd"/>
       <w:r>
-        <w:t xml:space="preserve"> </w:t>
-      </w:r>
-      <w:proofErr w:type="gramStart"/>
-      <w:r>
-        <w:t>matches</w:t>
-      </w:r>
-      <w:proofErr w:type="gramEnd"/>
-      <w:r>
-        <w:t xml:space="preserve"> then move to existing BA New Address</w:t>
+        <w:t xml:space="preserve"> matches then move to existing BA New Address</w:t>
       </w:r>
     </w:p>
     <w:p>
@@ -1003,7 +1376,7 @@
                     <pic:cNvPicPr/>
                   </pic:nvPicPr>
                   <pic:blipFill>
-                    <a:blip r:embed="rId21"/>
+                    <a:blip r:embed="rId22"/>
                     <a:stretch>
                       <a:fillRect/>
                     </a:stretch>
@@ -1102,7 +1475,7 @@
                     <pic:cNvPicPr/>
                   </pic:nvPicPr>
                   <pic:blipFill>
-                    <a:blip r:embed="rId22"/>
+                    <a:blip r:embed="rId23"/>
                     <a:stretch>
                       <a:fillRect/>
                     </a:stretch>
@@ -1147,7 +1520,7 @@
                     <pic:cNvPicPr/>
                   </pic:nvPicPr>
                   <pic:blipFill>
-                    <a:blip r:embed="rId23"/>
+                    <a:blip r:embed="rId24"/>
                     <a:stretch>
                       <a:fillRect/>
                     </a:stretch>
@@ -1192,7 +1565,7 @@
                     <pic:cNvPicPr/>
                   </pic:nvPicPr>
                   <pic:blipFill>
-                    <a:blip r:embed="rId24"/>
+                    <a:blip r:embed="rId25"/>
                     <a:stretch>
                       <a:fillRect/>
                     </a:stretch>
@@ -1242,7 +1615,7 @@
                     <pic:cNvPicPr/>
                   </pic:nvPicPr>
                   <pic:blipFill>
-                    <a:blip r:embed="rId25"/>
+                    <a:blip r:embed="rId26"/>
                     <a:stretch>
                       <a:fillRect/>
                     </a:stretch>
@@ -1273,51 +1646,10 @@
         <w:pStyle w:val="NoSpacing"/>
       </w:pPr>
       <w:r>
-        <w:lastRenderedPageBreak/>
-        <w:t xml:space="preserve">Why are street address and names, </w:t>
-      </w:r>
-      <w:proofErr w:type="gramStart"/>
-      <w:r>
-        <w:t>zip</w:t>
-      </w:r>
-      <w:proofErr w:type="gramEnd"/>
-      <w:r>
-        <w:t xml:space="preserve"> same but </w:t>
-      </w:r>
-      <w:proofErr w:type="gramStart"/>
-      <w:r>
-        <w:t>city</w:t>
-      </w:r>
-      <w:proofErr w:type="gramEnd"/>
-      <w:r>
-        <w:t xml:space="preserve"> different?  Should I put more emphasis on city names?</w:t>
-      </w:r>
-      <w:r>
-        <w:t xml:space="preserve">  Also, </w:t>
-      </w:r>
-      <w:proofErr w:type="gramStart"/>
-      <w:r>
-        <w:t>should I</w:t>
-      </w:r>
-      <w:proofErr w:type="gramEnd"/>
-      <w:r>
-        <w:t xml:space="preserve"> worry since there are only 137 at max like this.  And if I introduce </w:t>
-      </w:r>
-      <w:proofErr w:type="gramStart"/>
-      <w:r>
-        <w:t>the Smarty</w:t>
-      </w:r>
-      <w:proofErr w:type="gramEnd"/>
-      <w:r>
-        <w:t xml:space="preserve"> streets or Google API </w:t>
-      </w:r>
-      <w:proofErr w:type="gramStart"/>
-      <w:r>
-        <w:t>will that</w:t>
-      </w:r>
-      <w:proofErr w:type="gramEnd"/>
-      <w:r>
-        <w:t xml:space="preserve"> catch any issues like this?</w:t>
+        <w:t>Why are street address and names, zip same but city different?  Should I put more emphasis on city names?</w:t>
+      </w:r>
+      <w:r>
+        <w:t xml:space="preserve">  Also, should I worry since there are only 137 at max like this.  And if I introduce the Smarty streets or Google API will that catch any issues like this?</w:t>
       </w:r>
     </w:p>
     <w:p>
@@ -1344,7 +1676,7 @@
                     <pic:cNvPicPr/>
                   </pic:nvPicPr>
                   <pic:blipFill>
-                    <a:blip r:embed="rId26"/>
+                    <a:blip r:embed="rId27"/>
                     <a:stretch>
                       <a:fillRect/>
                     </a:stretch>
@@ -1415,7 +1747,7 @@
                     <pic:cNvPicPr/>
                   </pic:nvPicPr>
                   <pic:blipFill>
-                    <a:blip r:embed="rId27"/>
+                    <a:blip r:embed="rId28"/>
                     <a:stretch>
                       <a:fillRect/>
                     </a:stretch>
@@ -1476,7 +1808,7 @@
                     <pic:cNvPicPr/>
                   </pic:nvPicPr>
                   <pic:blipFill>
-                    <a:blip r:embed="rId28"/>
+                    <a:blip r:embed="rId29"/>
                     <a:stretch>
                       <a:fillRect/>
                     </a:stretch>
@@ -1702,7 +2034,6 @@
         <w:t xml:space="preserve">Can I auto populate BA Types, e.g. jib/rev/vendor, etc. – for </w:t>
       </w:r>
       <w:proofErr w:type="spellStart"/>
-      <w:proofErr w:type="gramStart"/>
       <w:r>
         <w:t>Enertia</w:t>
       </w:r>
@@ -1715,7 +2046,6 @@
         <w:t>Enertia</w:t>
       </w:r>
       <w:proofErr w:type="spellEnd"/>
-      <w:proofErr w:type="gramEnd"/>
       <w:r>
         <w:t xml:space="preserve"> conversions </w:t>
       </w:r>
@@ -3207,15 +3537,7 @@
         <w:pStyle w:val="NoSpacing"/>
       </w:pPr>
       <w:r>
-        <w:t xml:space="preserve">Done.  Automatically removed and placed in a file in </w:t>
-      </w:r>
-      <w:proofErr w:type="gramStart"/>
-      <w:r>
-        <w:t>the output</w:t>
-      </w:r>
-      <w:proofErr w:type="gramEnd"/>
-      <w:r>
-        <w:t xml:space="preserve"> </w:t>
+        <w:t xml:space="preserve">Done.  Automatically removed and placed in a file in the output </w:t>
       </w:r>
       <w:proofErr w:type="spellStart"/>
       <w:r>
@@ -3258,13 +3580,8 @@
         <w:pStyle w:val="NoSpacing"/>
       </w:pPr>
       <w:r>
-        <w:t xml:space="preserve">5. Easier way to mass </w:t>
-      </w:r>
-      <w:proofErr w:type="gramStart"/>
-      <w:r>
-        <w:t>approve</w:t>
-      </w:r>
-      <w:proofErr w:type="gramEnd"/>
+        <w:t>5. Easier way to mass approve</w:t>
+      </w:r>
     </w:p>
     <w:p>
       <w:pPr>
@@ -3327,7 +3644,7 @@
                     <pic:cNvPicPr/>
                   </pic:nvPicPr>
                   <pic:blipFill>
-                    <a:blip r:embed="rId29"/>
+                    <a:blip r:embed="rId30"/>
                     <a:stretch>
                       <a:fillRect/>
                     </a:stretch>
@@ -3420,15 +3737,7 @@
         <w:t>Allow them to choose a table or file for both source and target, then allow them to map</w:t>
       </w:r>
       <w:r>
-        <w:t xml:space="preserve"> fields for comparison like </w:t>
-      </w:r>
-      <w:proofErr w:type="gramStart"/>
-      <w:r>
-        <w:t>in order to</w:t>
-      </w:r>
-      <w:proofErr w:type="gramEnd"/>
-      <w:r>
-        <w:t xml:space="preserve"> merge existing users and addresses, these are usually always filled out so I think we need to stick with these:</w:t>
+        <w:t xml:space="preserve"> fields for comparison like in order to merge existing users and addresses, these are usually always filled out so I think we need to stick with these:</w:t>
       </w:r>
     </w:p>
     <w:p>
@@ -3568,7 +3877,6 @@
         <w:t xml:space="preserve">Can I auto populate BA Types, e.g. jib/rev/vendor, etc. – for </w:t>
       </w:r>
       <w:proofErr w:type="spellStart"/>
-      <w:proofErr w:type="gramStart"/>
       <w:r>
         <w:t>Enertia</w:t>
       </w:r>
@@ -3581,7 +3889,6 @@
         <w:t>Enertia</w:t>
       </w:r>
       <w:proofErr w:type="spellEnd"/>
-      <w:proofErr w:type="gramEnd"/>
       <w:r>
         <w:t xml:space="preserve"> conversions </w:t>
       </w:r>
@@ -3723,7 +4030,6 @@
                 <w:szCs w:val="22"/>
                 <w14:ligatures w14:val="none"/>
               </w:rPr>
-              <w:lastRenderedPageBreak/>
               <w:t>REVOWNER</w:t>
             </w:r>
           </w:p>
@@ -4756,6 +5062,7 @@
                 <w:szCs w:val="22"/>
                 <w14:ligatures w14:val="none"/>
               </w:rPr>
+              <w:lastRenderedPageBreak/>
               <w:t>CORRESPOND</w:t>
             </w:r>
           </w:p>
@@ -5123,7 +5430,7 @@
                     <pic:cNvPicPr/>
                   </pic:nvPicPr>
                   <pic:blipFill>
-                    <a:blip r:embed="rId30"/>
+                    <a:blip r:embed="rId31"/>
                     <a:stretch>
                       <a:fillRect/>
                     </a:stretch>
@@ -5167,7 +5474,6 @@
         <w:rPr>
           <w:noProof/>
         </w:rPr>
-        <w:lastRenderedPageBreak/>
         <w:drawing>
           <wp:inline distT="0" distB="0" distL="0" distR="0" wp14:anchorId="6F3AD46D" wp14:editId="61AC88B2">
             <wp:extent cx="9649427" cy="894840"/>
@@ -5184,7 +5490,7 @@
                     <pic:cNvPicPr/>
                   </pic:nvPicPr>
                   <pic:blipFill>
-                    <a:blip r:embed="rId31"/>
+                    <a:blip r:embed="rId32"/>
                     <a:stretch>
                       <a:fillRect/>
                     </a:stretch>
@@ -5242,7 +5548,7 @@
                     <pic:cNvPicPr/>
                   </pic:nvPicPr>
                   <pic:blipFill>
-                    <a:blip r:embed="rId32"/>
+                    <a:blip r:embed="rId33"/>
                     <a:stretch>
                       <a:fillRect/>
                     </a:stretch>
@@ -5300,7 +5606,7 @@
                     <pic:cNvPicPr/>
                   </pic:nvPicPr>
                   <pic:blipFill>
-                    <a:blip r:embed="rId33"/>
+                    <a:blip r:embed="rId34"/>
                     <a:stretch>
                       <a:fillRect/>
                     </a:stretch>
@@ -5394,13 +5700,8 @@
       </w:r>
       <w:proofErr w:type="spellEnd"/>
       <w:r>
-        <w:t xml:space="preserve"> new address must </w:t>
-      </w:r>
-      <w:proofErr w:type="gramStart"/>
-      <w:r>
-        <w:t>be  strict</w:t>
-      </w:r>
-      <w:proofErr w:type="gramEnd"/>
+        <w:t xml:space="preserve"> new address must be  strict</w:t>
+      </w:r>
     </w:p>
     <w:p>
       <w:pPr>
@@ -5426,7 +5727,7 @@
                     <pic:cNvPicPr/>
                   </pic:nvPicPr>
                   <pic:blipFill>
-                    <a:blip r:embed="rId34"/>
+                    <a:blip r:embed="rId35"/>
                     <a:stretch>
                       <a:fillRect/>
                     </a:stretch>
@@ -5578,15 +5879,7 @@
         </w:numPr>
       </w:pPr>
       <w:r>
-        <w:t xml:space="preserve">Ambiguous name scores (15–50) get sent to Claude Sonnet AI for a second opinion — "Do </w:t>
-      </w:r>
-      <w:proofErr w:type="gramStart"/>
-      <w:r>
-        <w:t>these business</w:t>
-      </w:r>
-      <w:proofErr w:type="gramEnd"/>
-      <w:r>
-        <w:t xml:space="preserve"> names refer to the same entity?" — overrides the score if AI disagrees</w:t>
+        <w:t>Ambiguous name scores (15–50) get sent to Claude Sonnet AI for a second opinion — "Do these business names refer to the same entity?" — overrides the score if AI disagrees</w:t>
       </w:r>
     </w:p>
     <w:p>
@@ -5601,19 +5894,7 @@
         <w:t>Address Scoring (bottom row, left to right)</w:t>
       </w:r>
       <w:r>
-        <w:t xml:space="preserve"> 4. Addresses are normalized — PO Box variants unified, street abbreviations standardized, dates stripped from address fields </w:t>
-      </w:r>
-      <w:r>
-        <w:lastRenderedPageBreak/>
-        <w:t xml:space="preserve">(data quality issue in source) 5. Address comparison has three paths: PO Box, Street, and Non-Standard (military </w:t>
-      </w:r>
-      <w:proofErr w:type="gramStart"/>
-      <w:r>
-        <w:t>addresses) —</w:t>
-      </w:r>
-      <w:proofErr w:type="gramEnd"/>
-      <w:r>
-        <w:t xml:space="preserve"> each with its own scoring formula combining street similarity and city similarity 6. Ambiguous address scores (15–65) get validated through Google's Address Validation API — both Canvas and DEC addresses are standardized, then re-scored. Persistent cache means zero API calls on re-runs</w:t>
+        <w:t xml:space="preserve"> 4. Addresses are normalized — PO Box variants unified, street abbreviations standardized, dates stripped from address fields (data quality issue in source) 5. Address comparison has three paths: PO Box, Street, and Non-Standard (military addresses) — each with its own scoring formula combining street similarity and city similarity 6. Ambiguous address scores (15–65) get validated through Google's Address Validation API — both Canvas and DEC addresses are standardized, then re-scored. Persistent cache means zero API calls on re-runs</w:t>
       </w:r>
     </w:p>
     <w:p>
@@ -5643,7 +5924,11 @@
         <w:t>Decision Priority (bottom legend)</w:t>
       </w:r>
       <w:r>
-        <w:t xml:space="preserve"> 9. Classification follows a strict priority order — API overrides first, then score thresholds, checked top-to-bottom, first match wins 10. All scores are rounded to nearest 5. Human review is mandatory — no auto-merge. The system recommends, humans decide</w:t>
+        <w:t xml:space="preserve"> 9. Classification follows a strict priority order — API overrides first, then score thresholds, checked top-to-bottom, first match wins 10. All </w:t>
+      </w:r>
+      <w:r>
+        <w:lastRenderedPageBreak/>
+        <w:t>scores are rounded to nearest 5. Human review is mandatory — no auto-merge. The system recommends, humans decide</w:t>
       </w:r>
     </w:p>
     <w:p>
@@ -5679,15 +5964,7 @@
         </w:numPr>
       </w:pPr>
       <w:r>
-        <w:t xml:space="preserve">Persistent </w:t>
-      </w:r>
-      <w:proofErr w:type="gramStart"/>
-      <w:r>
-        <w:t>caching</w:t>
-      </w:r>
-      <w:proofErr w:type="gramEnd"/>
-      <w:r>
-        <w:t xml:space="preserve"> = cost-controlled (no redundant API calls)</w:t>
+        <w:t>Persistent caching = cost-controlled (no redundant API calls)</w:t>
       </w:r>
     </w:p>
     <w:p>
@@ -5993,24 +6270,7 @@
         </w:numPr>
       </w:pPr>
       <w:r>
-        <w:lastRenderedPageBreak/>
-        <w:t>"Orange-highlighted rows flag records containing '</w:t>
-      </w:r>
-      <w:proofErr w:type="gramStart"/>
-      <w:r>
-        <w:t>trust' —</w:t>
-      </w:r>
-      <w:proofErr w:type="gramEnd"/>
-      <w:r>
-        <w:t xml:space="preserve"> </w:t>
-      </w:r>
-      <w:proofErr w:type="gramStart"/>
-      <w:r>
-        <w:t>draws</w:t>
-      </w:r>
-      <w:proofErr w:type="gramEnd"/>
-      <w:r>
-        <w:t xml:space="preserve"> attention for manual review"</w:t>
+        <w:t>"Orange-highlighted rows flag records containing 'trust' — draws attention for manual review"</w:t>
       </w:r>
     </w:p>
     <w:p>
@@ -6102,15 +6362,7 @@
         </w:numPr>
       </w:pPr>
       <w:r>
-        <w:t xml:space="preserve">"Or use the edit </w:t>
-      </w:r>
-      <w:proofErr w:type="gramStart"/>
-      <w:r>
-        <w:t>modal</w:t>
-      </w:r>
-      <w:proofErr w:type="gramEnd"/>
-      <w:r>
-        <w:t xml:space="preserve"> for detailed side-by-side Canvas vs DEC comparison"</w:t>
+        <w:t>"Or use the edit modal for detailed side-by-side Canvas vs DEC comparison"</w:t>
       </w:r>
     </w:p>
     <w:p>
@@ -6150,6 +6402,7 @@
           <w:b/>
           <w:bCs/>
         </w:rPr>
+        <w:lastRenderedPageBreak/>
         <w:t>8. Data Management</w:t>
       </w:r>
     </w:p>
@@ -7826,6 +8079,95 @@
     </w:lvl>
   </w:abstractNum>
   <w:abstractNum w:abstractNumId="11" w15:restartNumberingAfterBreak="0">
+    <w:nsid w:val="7B02499D"/>
+    <w:multiLevelType w:val="hybridMultilevel"/>
+    <w:tmpl w:val="30E674B6"/>
+    <w:lvl w:ilvl="0" w:tplc="0409000F">
+      <w:start w:val="1"/>
+      <w:numFmt w:val="decimal"/>
+      <w:lvlText w:val="%1."/>
+      <w:lvlJc w:val="left"/>
+      <w:pPr>
+        <w:ind w:left="720" w:hanging="360"/>
+      </w:pPr>
+      <w:rPr>
+        <w:rFonts w:hint="default"/>
+      </w:rPr>
+    </w:lvl>
+    <w:lvl w:ilvl="1" w:tplc="04090019" w:tentative="1">
+      <w:start w:val="1"/>
+      <w:numFmt w:val="lowerLetter"/>
+      <w:lvlText w:val="%2."/>
+      <w:lvlJc w:val="left"/>
+      <w:pPr>
+        <w:ind w:left="1440" w:hanging="360"/>
+      </w:pPr>
+    </w:lvl>
+    <w:lvl w:ilvl="2" w:tplc="0409001B" w:tentative="1">
+      <w:start w:val="1"/>
+      <w:numFmt w:val="lowerRoman"/>
+      <w:lvlText w:val="%3."/>
+      <w:lvlJc w:val="right"/>
+      <w:pPr>
+        <w:ind w:left="2160" w:hanging="180"/>
+      </w:pPr>
+    </w:lvl>
+    <w:lvl w:ilvl="3" w:tplc="0409000F" w:tentative="1">
+      <w:start w:val="1"/>
+      <w:numFmt w:val="decimal"/>
+      <w:lvlText w:val="%4."/>
+      <w:lvlJc w:val="left"/>
+      <w:pPr>
+        <w:ind w:left="2880" w:hanging="360"/>
+      </w:pPr>
+    </w:lvl>
+    <w:lvl w:ilvl="4" w:tplc="04090019" w:tentative="1">
+      <w:start w:val="1"/>
+      <w:numFmt w:val="lowerLetter"/>
+      <w:lvlText w:val="%5."/>
+      <w:lvlJc w:val="left"/>
+      <w:pPr>
+        <w:ind w:left="3600" w:hanging="360"/>
+      </w:pPr>
+    </w:lvl>
+    <w:lvl w:ilvl="5" w:tplc="0409001B" w:tentative="1">
+      <w:start w:val="1"/>
+      <w:numFmt w:val="lowerRoman"/>
+      <w:lvlText w:val="%6."/>
+      <w:lvlJc w:val="right"/>
+      <w:pPr>
+        <w:ind w:left="4320" w:hanging="180"/>
+      </w:pPr>
+    </w:lvl>
+    <w:lvl w:ilvl="6" w:tplc="0409000F" w:tentative="1">
+      <w:start w:val="1"/>
+      <w:numFmt w:val="decimal"/>
+      <w:lvlText w:val="%7."/>
+      <w:lvlJc w:val="left"/>
+      <w:pPr>
+        <w:ind w:left="5040" w:hanging="360"/>
+      </w:pPr>
+    </w:lvl>
+    <w:lvl w:ilvl="7" w:tplc="04090019" w:tentative="1">
+      <w:start w:val="1"/>
+      <w:numFmt w:val="lowerLetter"/>
+      <w:lvlText w:val="%8."/>
+      <w:lvlJc w:val="left"/>
+      <w:pPr>
+        <w:ind w:left="5760" w:hanging="360"/>
+      </w:pPr>
+    </w:lvl>
+    <w:lvl w:ilvl="8" w:tplc="0409001B" w:tentative="1">
+      <w:start w:val="1"/>
+      <w:numFmt w:val="lowerRoman"/>
+      <w:lvlText w:val="%9."/>
+      <w:lvlJc w:val="right"/>
+      <w:pPr>
+        <w:ind w:left="6480" w:hanging="180"/>
+      </w:pPr>
+    </w:lvl>
+  </w:abstractNum>
+  <w:abstractNum w:abstractNumId="12" w15:restartNumberingAfterBreak="0">
     <w:nsid w:val="7B7A4C78"/>
     <w:multiLevelType w:val="multilevel"/>
     <w:tmpl w:val="D264E08C"/>
@@ -7993,7 +8335,7 @@
     <w:abstractNumId w:val="3"/>
   </w:num>
   <w:num w:numId="7" w16cid:durableId="250086959">
-    <w:abstractNumId w:val="11"/>
+    <w:abstractNumId w:val="12"/>
   </w:num>
   <w:num w:numId="8" w16cid:durableId="400366779">
     <w:abstractNumId w:val="10"/>
@@ -8009,6 +8351,9 @@
   </w:num>
   <w:num w:numId="12" w16cid:durableId="68817628">
     <w:abstractNumId w:val="6"/>
+  </w:num>
+  <w:num w:numId="13" w16cid:durableId="456722028">
+    <w:abstractNumId w:val="11"/>
   </w:num>
 </w:numbering>
 </file>

</xml_diff>

<commit_message>
Remove Process column bulk update, make Source Addr read-only, route Source Addr Recomend edits to SOURCE_ADDRESS in Snowflake
- Remove right-click context menu on Process column header (bulk update all visible rows)
- Make Source Addr column read-only in the grid
- Wire Source Addr Recomend for inline editing, search/replace, and edit modal saves
- Add field_to_db_col mapping in merge_changes_to_snowflake so source_address_recomend writes to SOURCE_ADDRESS column
- Add /api/db_record endpoint for direct Snowflake record lookup
- Update tests, helpers, docs, and config files

Co-Authored-By: Claude Opus 4.6 (1M context) <noreply@anthropic.com>
</commit_message>
<xml_diff>
--- a/Things to consider.docx
+++ b/Things to consider.docx
@@ -4,6 +4,278 @@
   <w:body>
     <w:p>
       <w:pPr>
+        <w:pStyle w:val="ListParagraph"/>
+        <w:numPr>
+          <w:ilvl w:val="0"/>
+          <w:numId w:val="14"/>
+        </w:numPr>
+      </w:pPr>
+      <w:r>
+        <w:t xml:space="preserve">Mismatch on </w:t>
+      </w:r>
+      <w:proofErr w:type="spellStart"/>
+      <w:r>
+        <w:t>ssn</w:t>
+      </w:r>
+      <w:proofErr w:type="spellEnd"/>
+      <w:r>
+        <w:t xml:space="preserve"> or missing on either</w:t>
+      </w:r>
+    </w:p>
+    <w:p>
+      <w:pPr>
+        <w:pStyle w:val="ListParagraph"/>
+        <w:numPr>
+          <w:ilvl w:val="0"/>
+          <w:numId w:val="14"/>
+        </w:numPr>
+      </w:pPr>
+      <w:r>
+        <w:t xml:space="preserve">Warn on close if there are pending saves. Or run code to </w:t>
+      </w:r>
+      <w:proofErr w:type="spellStart"/>
+      <w:r>
+        <w:t>upate</w:t>
+      </w:r>
+      <w:proofErr w:type="spellEnd"/>
+      <w:r>
+        <w:t xml:space="preserve"> save changes count on button when opening.</w:t>
+      </w:r>
+    </w:p>
+    <w:p>
+      <w:pPr>
+        <w:pStyle w:val="ListParagraph"/>
+        <w:numPr>
+          <w:ilvl w:val="0"/>
+          <w:numId w:val="14"/>
+        </w:numPr>
+      </w:pPr>
+      <w:r>
+        <w:t>Feedback loop.  Multiple time through</w:t>
+      </w:r>
+    </w:p>
+    <w:p/>
+    <w:p>
+      <w:pPr>
+        <w:ind w:left="720" w:hanging="360"/>
+      </w:pPr>
+      <w:proofErr w:type="gramStart"/>
+      <w:r>
+        <w:t>Need</w:t>
+      </w:r>
+      <w:proofErr w:type="gramEnd"/>
+      <w:r>
+        <w:t xml:space="preserve"> to talk about Source address (addraddr1+2). Extra fields like nam1, 2, 3. Phone, fax, email, </w:t>
+      </w:r>
+      <w:proofErr w:type="spellStart"/>
+      <w:r>
+        <w:t>addrnonresident</w:t>
+      </w:r>
+      <w:proofErr w:type="spellEnd"/>
+      <w:r>
+        <w:t xml:space="preserve">, </w:t>
+      </w:r>
+      <w:proofErr w:type="spellStart"/>
+      <w:r>
+        <w:t>is_corp</w:t>
+      </w:r>
+      <w:proofErr w:type="spellEnd"/>
+      <w:r>
+        <w:t xml:space="preserve">, </w:t>
+      </w:r>
+      <w:proofErr w:type="spellStart"/>
+      <w:r>
+        <w:t>entity_list_name</w:t>
+      </w:r>
+      <w:proofErr w:type="spellEnd"/>
+      <w:r>
+        <w:t>, ACH fields, etc.</w:t>
+      </w:r>
+    </w:p>
+    <w:p>
+      <w:pPr>
+        <w:ind w:left="720" w:hanging="360"/>
+      </w:pPr>
+    </w:p>
+    <w:p>
+      <w:pPr>
+        <w:ind w:left="720" w:hanging="360"/>
+      </w:pPr>
+      <w:r>
+        <w:t xml:space="preserve">Done. Added a custom </w:t>
+      </w:r>
+      <w:proofErr w:type="spellStart"/>
+      <w:r>
+        <w:t>cellRenderer</w:t>
+      </w:r>
+      <w:proofErr w:type="spellEnd"/>
+      <w:r>
+        <w:t xml:space="preserve"> to the Source </w:t>
+      </w:r>
+      <w:proofErr w:type="spellStart"/>
+      <w:r>
+        <w:t>Addr</w:t>
+      </w:r>
+      <w:proofErr w:type="spellEnd"/>
+      <w:r>
+        <w:t xml:space="preserve"> column that splits the value by lines and renders characters past position 45 on each line in red. Lines at or under 45 characters display normally. Hard refresh to see the change.</w:t>
+      </w:r>
+    </w:p>
+    <w:p>
+      <w:pPr>
+        <w:ind w:left="720" w:hanging="360"/>
+      </w:pPr>
+      <w:r>
+        <w:t xml:space="preserve">No </w:t>
+      </w:r>
+      <w:proofErr w:type="spellStart"/>
+      <w:proofErr w:type="gramStart"/>
+      <w:r>
+        <w:t>SSN,Duplicate</w:t>
+      </w:r>
+      <w:proofErr w:type="spellEnd"/>
+      <w:proofErr w:type="gramEnd"/>
+      <w:r>
+        <w:t xml:space="preserve"> address</w:t>
+      </w:r>
+    </w:p>
+    <w:p>
+      <w:pPr>
+        <w:ind w:left="720" w:hanging="360"/>
+      </w:pPr>
+      <w:r>
+        <w:rPr>
+          <w:noProof/>
+        </w:rPr>
+        <w:drawing>
+          <wp:inline distT="0" distB="0" distL="0" distR="0" wp14:anchorId="7A722134" wp14:editId="75797631">
+            <wp:extent cx="5943600" cy="157480"/>
+            <wp:effectExtent l="0" t="0" r="0" b="0"/>
+            <wp:docPr id="1706015030" name="Picture 1"/>
+            <wp:cNvGraphicFramePr>
+              <a:graphicFrameLocks xmlns:a="http://schemas.openxmlformats.org/drawingml/2006/main" noChangeAspect="1"/>
+            </wp:cNvGraphicFramePr>
+            <a:graphic xmlns:a="http://schemas.openxmlformats.org/drawingml/2006/main">
+              <a:graphicData uri="http://schemas.openxmlformats.org/drawingml/2006/picture">
+                <pic:pic xmlns:pic="http://schemas.openxmlformats.org/drawingml/2006/picture">
+                  <pic:nvPicPr>
+                    <pic:cNvPr id="1706015030" name=""/>
+                    <pic:cNvPicPr/>
+                  </pic:nvPicPr>
+                  <pic:blipFill>
+                    <a:blip r:embed="rId5"/>
+                    <a:stretch>
+                      <a:fillRect/>
+                    </a:stretch>
+                  </pic:blipFill>
+                  <pic:spPr>
+                    <a:xfrm>
+                      <a:off x="0" y="0"/>
+                      <a:ext cx="5943600" cy="157480"/>
+                    </a:xfrm>
+                    <a:prstGeom prst="rect">
+                      <a:avLst/>
+                    </a:prstGeom>
+                  </pic:spPr>
+                </pic:pic>
+              </a:graphicData>
+            </a:graphic>
+          </wp:inline>
+        </w:drawing>
+      </w:r>
+    </w:p>
+    <w:p>
+      <w:pPr>
+        <w:ind w:left="720" w:hanging="360"/>
+      </w:pPr>
+      <w:r>
+        <w:rPr>
+          <w:noProof/>
+        </w:rPr>
+        <w:drawing>
+          <wp:inline distT="0" distB="0" distL="0" distR="0" wp14:anchorId="534540EB" wp14:editId="693B4DCE">
+            <wp:extent cx="5943600" cy="262890"/>
+            <wp:effectExtent l="0" t="0" r="0" b="3810"/>
+            <wp:docPr id="723505178" name="Picture 1"/>
+            <wp:cNvGraphicFramePr>
+              <a:graphicFrameLocks xmlns:a="http://schemas.openxmlformats.org/drawingml/2006/main" noChangeAspect="1"/>
+            </wp:cNvGraphicFramePr>
+            <a:graphic xmlns:a="http://schemas.openxmlformats.org/drawingml/2006/main">
+              <a:graphicData uri="http://schemas.openxmlformats.org/drawingml/2006/picture">
+                <pic:pic xmlns:pic="http://schemas.openxmlformats.org/drawingml/2006/picture">
+                  <pic:nvPicPr>
+                    <pic:cNvPr id="723505178" name=""/>
+                    <pic:cNvPicPr/>
+                  </pic:nvPicPr>
+                  <pic:blipFill>
+                    <a:blip r:embed="rId6"/>
+                    <a:stretch>
+                      <a:fillRect/>
+                    </a:stretch>
+                  </pic:blipFill>
+                  <pic:spPr>
+                    <a:xfrm>
+                      <a:off x="0" y="0"/>
+                      <a:ext cx="5943600" cy="262890"/>
+                    </a:xfrm>
+                    <a:prstGeom prst="rect">
+                      <a:avLst/>
+                    </a:prstGeom>
+                  </pic:spPr>
+                </pic:pic>
+              </a:graphicData>
+            </a:graphic>
+          </wp:inline>
+        </w:drawing>
+      </w:r>
+    </w:p>
+    <w:p>
+      <w:pPr>
+        <w:ind w:left="720" w:hanging="360"/>
+      </w:pPr>
+      <w:r>
+        <w:rPr>
+          <w:noProof/>
+        </w:rPr>
+        <w:drawing>
+          <wp:inline distT="0" distB="0" distL="0" distR="0" wp14:anchorId="64659592" wp14:editId="6D3B04DD">
+            <wp:extent cx="5943600" cy="243205"/>
+            <wp:effectExtent l="0" t="0" r="0" b="4445"/>
+            <wp:docPr id="2069297291" name="Picture 1"/>
+            <wp:cNvGraphicFramePr>
+              <a:graphicFrameLocks xmlns:a="http://schemas.openxmlformats.org/drawingml/2006/main" noChangeAspect="1"/>
+            </wp:cNvGraphicFramePr>
+            <a:graphic xmlns:a="http://schemas.openxmlformats.org/drawingml/2006/main">
+              <a:graphicData uri="http://schemas.openxmlformats.org/drawingml/2006/picture">
+                <pic:pic xmlns:pic="http://schemas.openxmlformats.org/drawingml/2006/picture">
+                  <pic:nvPicPr>
+                    <pic:cNvPr id="2069297291" name=""/>
+                    <pic:cNvPicPr/>
+                  </pic:nvPicPr>
+                  <pic:blipFill>
+                    <a:blip r:embed="rId7"/>
+                    <a:stretch>
+                      <a:fillRect/>
+                    </a:stretch>
+                  </pic:blipFill>
+                  <pic:spPr>
+                    <a:xfrm>
+                      <a:off x="0" y="0"/>
+                      <a:ext cx="5943600" cy="243205"/>
+                    </a:xfrm>
+                    <a:prstGeom prst="rect">
+                      <a:avLst/>
+                    </a:prstGeom>
+                  </pic:spPr>
+                </pic:pic>
+              </a:graphicData>
+            </a:graphic>
+          </wp:inline>
+        </w:drawing>
+      </w:r>
+    </w:p>
+    <w:p>
+      <w:pPr>
         <w:ind w:left="720" w:hanging="360"/>
       </w:pPr>
       <w:r>
@@ -34,7 +306,15 @@
         </w:numPr>
       </w:pPr>
       <w:r>
-        <w:t xml:space="preserve">Work with client </w:t>
+        <w:t xml:space="preserve">Work with </w:t>
+      </w:r>
+      <w:proofErr w:type="gramStart"/>
+      <w:r>
+        <w:t>client</w:t>
+      </w:r>
+      <w:proofErr w:type="gramEnd"/>
+      <w:r>
+        <w:t xml:space="preserve"> </w:t>
       </w:r>
       <w:r>
         <w:t>to load source, give template</w:t>
@@ -55,10 +335,12 @@
         <w:t xml:space="preserve">Think about how delta data works, on new </w:t>
       </w:r>
       <w:proofErr w:type="spellStart"/>
+      <w:proofErr w:type="gramStart"/>
       <w:r>
         <w:t>datasources</w:t>
       </w:r>
       <w:proofErr w:type="spellEnd"/>
+      <w:proofErr w:type="gramEnd"/>
       <w:r>
         <w:t>.</w:t>
       </w:r>
@@ -71,8 +353,13 @@
           <w:numId w:val="13"/>
         </w:numPr>
       </w:pPr>
-      <w:r>
-        <w:t>Meet with Steve on MVP</w:t>
+      <w:proofErr w:type="gramStart"/>
+      <w:r>
+        <w:t>Meet with</w:t>
+      </w:r>
+      <w:proofErr w:type="gramEnd"/>
+      <w:r>
+        <w:t xml:space="preserve"> Steve on MVP</w:t>
       </w:r>
       <w:r>
         <w:t>.</w:t>
@@ -86,8 +373,29 @@
           <w:numId w:val="13"/>
         </w:numPr>
       </w:pPr>
-      <w:r>
-        <w:t>If same address then use newest seq number</w:t>
+      <w:proofErr w:type="gramStart"/>
+      <w:r>
+        <w:t>If</w:t>
+      </w:r>
+      <w:proofErr w:type="gramEnd"/>
+      <w:r>
+        <w:t xml:space="preserve"> same </w:t>
+      </w:r>
+      <w:proofErr w:type="gramStart"/>
+      <w:r>
+        <w:t>address</w:t>
+      </w:r>
+      <w:proofErr w:type="gramEnd"/>
+      <w:r>
+        <w:t xml:space="preserve"> then </w:t>
+      </w:r>
+      <w:proofErr w:type="gramStart"/>
+      <w:r>
+        <w:t>use</w:t>
+      </w:r>
+      <w:proofErr w:type="gramEnd"/>
+      <w:r>
+        <w:t xml:space="preserve"> newest seq number</w:t>
       </w:r>
       <w:r>
         <w:t>.</w:t>
@@ -120,7 +428,15 @@
         </w:numPr>
       </w:pPr>
       <w:r>
-        <w:t>Allow changes on source for new addresses</w:t>
+        <w:t xml:space="preserve">Allow changes </w:t>
+      </w:r>
+      <w:proofErr w:type="gramStart"/>
+      <w:r>
+        <w:t>on</w:t>
+      </w:r>
+      <w:proofErr w:type="gramEnd"/>
+      <w:r>
+        <w:t xml:space="preserve"> source for new addresses</w:t>
       </w:r>
     </w:p>
     <w:p>
@@ -236,6 +552,7 @@
         <w:pStyle w:val="NoSpacing"/>
       </w:pPr>
       <w:r>
+        <w:lastRenderedPageBreak/>
         <w:t>Street address goes on 1</w:t>
       </w:r>
       <w:r>
@@ -324,7 +641,7 @@
                     <pic:cNvPicPr/>
                   </pic:nvPicPr>
                   <pic:blipFill>
-                    <a:blip r:embed="rId5"/>
+                    <a:blip r:embed="rId8"/>
                     <a:stretch>
                       <a:fillRect/>
                     </a:stretch>
@@ -398,7 +715,7 @@
                     <pic:cNvPicPr/>
                   </pic:nvPicPr>
                   <pic:blipFill>
-                    <a:blip r:embed="rId6"/>
+                    <a:blip r:embed="rId9"/>
                     <a:stretch>
                       <a:fillRect/>
                     </a:stretch>
@@ -443,7 +760,7 @@
                     <pic:cNvPicPr/>
                   </pic:nvPicPr>
                   <pic:blipFill>
-                    <a:blip r:embed="rId7"/>
+                    <a:blip r:embed="rId10"/>
                     <a:stretch>
                       <a:fillRect/>
                     </a:stretch>
@@ -488,7 +805,7 @@
                     <pic:cNvPicPr/>
                   </pic:nvPicPr>
                   <pic:blipFill>
-                    <a:blip r:embed="rId8"/>
+                    <a:blip r:embed="rId11"/>
                     <a:stretch>
                       <a:fillRect/>
                     </a:stretch>
@@ -533,7 +850,7 @@
                     <pic:cNvPicPr/>
                   </pic:nvPicPr>
                   <pic:blipFill>
-                    <a:blip r:embed="rId9"/>
+                    <a:blip r:embed="rId12"/>
                     <a:stretch>
                       <a:fillRect/>
                     </a:stretch>
@@ -578,7 +895,7 @@
                     <pic:cNvPicPr/>
                   </pic:nvPicPr>
                   <pic:blipFill>
-                    <a:blip r:embed="rId10"/>
+                    <a:blip r:embed="rId13"/>
                     <a:stretch>
                       <a:fillRect/>
                     </a:stretch>
@@ -623,7 +940,7 @@
                     <pic:cNvPicPr/>
                   </pic:nvPicPr>
                   <pic:blipFill>
-                    <a:blip r:embed="rId11"/>
+                    <a:blip r:embed="rId14"/>
                     <a:stretch>
                       <a:fillRect/>
                     </a:stretch>
@@ -668,7 +985,7 @@
                     <pic:cNvPicPr/>
                   </pic:nvPicPr>
                   <pic:blipFill>
-                    <a:blip r:embed="rId12"/>
+                    <a:blip r:embed="rId15"/>
                     <a:stretch>
                       <a:fillRect/>
                     </a:stretch>
@@ -713,7 +1030,7 @@
                     <pic:cNvPicPr/>
                   </pic:nvPicPr>
                   <pic:blipFill>
-                    <a:blip r:embed="rId13"/>
+                    <a:blip r:embed="rId16"/>
                     <a:stretch>
                       <a:fillRect/>
                     </a:stretch>
@@ -758,7 +1075,7 @@
                     <pic:cNvPicPr/>
                   </pic:nvPicPr>
                   <pic:blipFill>
-                    <a:blip r:embed="rId14"/>
+                    <a:blip r:embed="rId17"/>
                     <a:stretch>
                       <a:fillRect/>
                     </a:stretch>
@@ -787,7 +1104,6 @@
         <w:rPr>
           <w:noProof/>
         </w:rPr>
-        <w:lastRenderedPageBreak/>
         <w:drawing>
           <wp:inline distT="0" distB="0" distL="0" distR="0" wp14:anchorId="36C45559" wp14:editId="375879EF">
             <wp:extent cx="5943600" cy="81915"/>
@@ -804,7 +1120,7 @@
                     <pic:cNvPicPr/>
                   </pic:nvPicPr>
                   <pic:blipFill>
-                    <a:blip r:embed="rId15"/>
+                    <a:blip r:embed="rId18"/>
                     <a:stretch>
                       <a:fillRect/>
                     </a:stretch>
@@ -849,7 +1165,7 @@
                     <pic:cNvPicPr/>
                   </pic:nvPicPr>
                   <pic:blipFill>
-                    <a:blip r:embed="rId16"/>
+                    <a:blip r:embed="rId19"/>
                     <a:stretch>
                       <a:fillRect/>
                     </a:stretch>
@@ -904,7 +1220,7 @@
                     <pic:cNvPicPr/>
                   </pic:nvPicPr>
                   <pic:blipFill>
-                    <a:blip r:embed="rId17"/>
+                    <a:blip r:embed="rId20"/>
                     <a:stretch>
                       <a:fillRect/>
                     </a:stretch>
@@ -967,7 +1283,7 @@
                     <pic:cNvPicPr/>
                   </pic:nvPicPr>
                   <pic:blipFill>
-                    <a:blip r:embed="rId18"/>
+                    <a:blip r:embed="rId21"/>
                     <a:stretch>
                       <a:fillRect/>
                     </a:stretch>
@@ -1030,7 +1346,7 @@
                     <pic:cNvPicPr/>
                   </pic:nvPicPr>
                   <pic:blipFill>
-                    <a:blip r:embed="rId19"/>
+                    <a:blip r:embed="rId22"/>
                     <a:stretch>
                       <a:fillRect/>
                     </a:stretch>
@@ -1073,8 +1389,13 @@
       <w:pPr>
         <w:pStyle w:val="NoSpacing"/>
       </w:pPr>
-      <w:r>
-        <w:t>At 100% accuracy:</w:t>
+      <w:proofErr w:type="gramStart"/>
+      <w:r>
+        <w:t>At 100</w:t>
+      </w:r>
+      <w:proofErr w:type="gramEnd"/>
+      <w:r>
+        <w:t>% accuracy:</w:t>
       </w:r>
     </w:p>
     <w:p>
@@ -1101,7 +1422,7 @@
                     <pic:cNvPicPr/>
                   </pic:nvPicPr>
                   <pic:blipFill>
-                    <a:blip r:embed="rId20"/>
+                    <a:blip r:embed="rId23"/>
                     <a:stretch>
                       <a:fillRect/>
                     </a:stretch>
@@ -1142,7 +1463,15 @@
         <w:pStyle w:val="NoSpacing"/>
       </w:pPr>
       <w:r>
-        <w:t xml:space="preserve">May need a new bucket or status or column that states all numbers in address match AND city, state, zip match, which I would think would let the user make changes based on this.  But need to look at why the 0 match.   </w:t>
+        <w:t xml:space="preserve">May need a new bucket or status or column that states all numbers in address match AND city, state, zip match, which I would think would let the user make changes based on this.  </w:t>
+      </w:r>
+      <w:proofErr w:type="gramStart"/>
+      <w:r>
+        <w:t>But</w:t>
+      </w:r>
+      <w:proofErr w:type="gramEnd"/>
+      <w:r>
+        <w:t xml:space="preserve"> need to look at why the 0 match.   </w:t>
       </w:r>
     </w:p>
     <w:p>
@@ -1269,7 +1598,6 @@
         <w:pStyle w:val="NoSpacing"/>
       </w:pPr>
       <w:r>
-        <w:lastRenderedPageBreak/>
         <w:t>API access:</w:t>
       </w:r>
     </w:p>
@@ -1297,7 +1625,7 @@
                     <pic:cNvPicPr/>
                   </pic:nvPicPr>
                   <pic:blipFill>
-                    <a:blip r:embed="rId21"/>
+                    <a:blip r:embed="rId24"/>
                     <a:stretch>
                       <a:fillRect/>
                     </a:stretch>
@@ -1341,7 +1669,15 @@
       </w:r>
       <w:proofErr w:type="spellEnd"/>
       <w:r>
-        <w:t xml:space="preserve"> score is low and name is fairly high and </w:t>
+        <w:t xml:space="preserve"> score is low and name is </w:t>
+      </w:r>
+      <w:proofErr w:type="gramStart"/>
+      <w:r>
+        <w:t>fairly high</w:t>
+      </w:r>
+      <w:proofErr w:type="gramEnd"/>
+      <w:r>
+        <w:t xml:space="preserve"> and </w:t>
       </w:r>
       <w:proofErr w:type="spellStart"/>
       <w:r>
@@ -1349,7 +1685,15 @@
       </w:r>
       <w:proofErr w:type="spellEnd"/>
       <w:r>
-        <w:t xml:space="preserve"> matches then move to existing BA New Address</w:t>
+        <w:t xml:space="preserve"> </w:t>
+      </w:r>
+      <w:proofErr w:type="gramStart"/>
+      <w:r>
+        <w:t>matches</w:t>
+      </w:r>
+      <w:proofErr w:type="gramEnd"/>
+      <w:r>
+        <w:t xml:space="preserve"> then move to existing BA New Address</w:t>
       </w:r>
     </w:p>
     <w:p>
@@ -1376,7 +1720,7 @@
                     <pic:cNvPicPr/>
                   </pic:nvPicPr>
                   <pic:blipFill>
-                    <a:blip r:embed="rId22"/>
+                    <a:blip r:embed="rId25"/>
                     <a:stretch>
                       <a:fillRect/>
                     </a:stretch>
@@ -1422,6 +1766,7 @@
         <w:pStyle w:val="NoSpacing"/>
       </w:pPr>
       <w:r>
+        <w:lastRenderedPageBreak/>
         <w:t>**** Need to add the address seq from Canvas.</w:t>
       </w:r>
     </w:p>
@@ -1475,7 +1820,7 @@
                     <pic:cNvPicPr/>
                   </pic:nvPicPr>
                   <pic:blipFill>
-                    <a:blip r:embed="rId23"/>
+                    <a:blip r:embed="rId26"/>
                     <a:stretch>
                       <a:fillRect/>
                     </a:stretch>
@@ -1520,7 +1865,7 @@
                     <pic:cNvPicPr/>
                   </pic:nvPicPr>
                   <pic:blipFill>
-                    <a:blip r:embed="rId24"/>
+                    <a:blip r:embed="rId27"/>
                     <a:stretch>
                       <a:fillRect/>
                     </a:stretch>
@@ -1565,7 +1910,7 @@
                     <pic:cNvPicPr/>
                   </pic:nvPicPr>
                   <pic:blipFill>
-                    <a:blip r:embed="rId25"/>
+                    <a:blip r:embed="rId28"/>
                     <a:stretch>
                       <a:fillRect/>
                     </a:stretch>
@@ -1615,7 +1960,7 @@
                     <pic:cNvPicPr/>
                   </pic:nvPicPr>
                   <pic:blipFill>
-                    <a:blip r:embed="rId26"/>
+                    <a:blip r:embed="rId29"/>
                     <a:stretch>
                       <a:fillRect/>
                     </a:stretch>
@@ -1646,10 +1991,50 @@
         <w:pStyle w:val="NoSpacing"/>
       </w:pPr>
       <w:r>
-        <w:t>Why are street address and names, zip same but city different?  Should I put more emphasis on city names?</w:t>
-      </w:r>
-      <w:r>
-        <w:t xml:space="preserve">  Also, should I worry since there are only 137 at max like this.  And if I introduce the Smarty streets or Google API will that catch any issues like this?</w:t>
+        <w:t xml:space="preserve">Why are street address and names, </w:t>
+      </w:r>
+      <w:proofErr w:type="gramStart"/>
+      <w:r>
+        <w:t>zip</w:t>
+      </w:r>
+      <w:proofErr w:type="gramEnd"/>
+      <w:r>
+        <w:t xml:space="preserve"> same but </w:t>
+      </w:r>
+      <w:proofErr w:type="gramStart"/>
+      <w:r>
+        <w:t>city</w:t>
+      </w:r>
+      <w:proofErr w:type="gramEnd"/>
+      <w:r>
+        <w:t xml:space="preserve"> different?  Should I put more emphasis on city names?</w:t>
+      </w:r>
+      <w:r>
+        <w:t xml:space="preserve">  Also, </w:t>
+      </w:r>
+      <w:proofErr w:type="gramStart"/>
+      <w:r>
+        <w:t>should I</w:t>
+      </w:r>
+      <w:proofErr w:type="gramEnd"/>
+      <w:r>
+        <w:t xml:space="preserve"> worry since there are only 137 at max like this.  And if I introduce </w:t>
+      </w:r>
+      <w:proofErr w:type="gramStart"/>
+      <w:r>
+        <w:t>the Smarty</w:t>
+      </w:r>
+      <w:proofErr w:type="gramEnd"/>
+      <w:r>
+        <w:t xml:space="preserve"> streets or Google API </w:t>
+      </w:r>
+      <w:proofErr w:type="gramStart"/>
+      <w:r>
+        <w:t>will that</w:t>
+      </w:r>
+      <w:proofErr w:type="gramEnd"/>
+      <w:r>
+        <w:t xml:space="preserve"> catch any issues like this?</w:t>
       </w:r>
     </w:p>
     <w:p>
@@ -1676,7 +2061,7 @@
                     <pic:cNvPicPr/>
                   </pic:nvPicPr>
                   <pic:blipFill>
-                    <a:blip r:embed="rId27"/>
+                    <a:blip r:embed="rId30"/>
                     <a:stretch>
                       <a:fillRect/>
                     </a:stretch>
@@ -1747,7 +2132,7 @@
                     <pic:cNvPicPr/>
                   </pic:nvPicPr>
                   <pic:blipFill>
-                    <a:blip r:embed="rId28"/>
+                    <a:blip r:embed="rId31"/>
                     <a:stretch>
                       <a:fillRect/>
                     </a:stretch>
@@ -1808,7 +2193,7 @@
                     <pic:cNvPicPr/>
                   </pic:nvPicPr>
                   <pic:blipFill>
-                    <a:blip r:embed="rId29"/>
+                    <a:blip r:embed="rId32"/>
                     <a:stretch>
                       <a:fillRect/>
                     </a:stretch>
@@ -2034,6 +2419,7 @@
         <w:t xml:space="preserve">Can I auto populate BA Types, e.g. jib/rev/vendor, etc. – for </w:t>
       </w:r>
       <w:proofErr w:type="spellStart"/>
+      <w:proofErr w:type="gramStart"/>
       <w:r>
         <w:t>Enertia</w:t>
       </w:r>
@@ -2046,6 +2432,7 @@
         <w:t>Enertia</w:t>
       </w:r>
       <w:proofErr w:type="spellEnd"/>
+      <w:proofErr w:type="gramEnd"/>
       <w:r>
         <w:t xml:space="preserve"> conversions </w:t>
       </w:r>
@@ -2703,6 +3090,7 @@
                 <w:szCs w:val="22"/>
                 <w14:ligatures w14:val="none"/>
               </w:rPr>
+              <w:lastRenderedPageBreak/>
               <w:t>OPER</w:t>
             </w:r>
           </w:p>
@@ -3537,7 +3925,15 @@
         <w:pStyle w:val="NoSpacing"/>
       </w:pPr>
       <w:r>
-        <w:t xml:space="preserve">Done.  Automatically removed and placed in a file in the output </w:t>
+        <w:t xml:space="preserve">Done.  Automatically removed and placed in a file in </w:t>
+      </w:r>
+      <w:proofErr w:type="gramStart"/>
+      <w:r>
+        <w:t>the output</w:t>
+      </w:r>
+      <w:proofErr w:type="gramEnd"/>
+      <w:r>
+        <w:t xml:space="preserve"> </w:t>
       </w:r>
       <w:proofErr w:type="spellStart"/>
       <w:r>
@@ -3580,8 +3976,13 @@
         <w:pStyle w:val="NoSpacing"/>
       </w:pPr>
       <w:r>
-        <w:t>5. Easier way to mass approve</w:t>
-      </w:r>
+        <w:t xml:space="preserve">5. Easier way to mass </w:t>
+      </w:r>
+      <w:proofErr w:type="gramStart"/>
+      <w:r>
+        <w:t>approve</w:t>
+      </w:r>
+      <w:proofErr w:type="gramEnd"/>
     </w:p>
     <w:p>
       <w:pPr>
@@ -3644,7 +4045,7 @@
                     <pic:cNvPicPr/>
                   </pic:nvPicPr>
                   <pic:blipFill>
-                    <a:blip r:embed="rId30"/>
+                    <a:blip r:embed="rId33"/>
                     <a:stretch>
                       <a:fillRect/>
                     </a:stretch>
@@ -3737,7 +4138,15 @@
         <w:t>Allow them to choose a table or file for both source and target, then allow them to map</w:t>
       </w:r>
       <w:r>
-        <w:t xml:space="preserve"> fields for comparison like in order to merge existing users and addresses, these are usually always filled out so I think we need to stick with these:</w:t>
+        <w:t xml:space="preserve"> fields for comparison like </w:t>
+      </w:r>
+      <w:proofErr w:type="gramStart"/>
+      <w:r>
+        <w:t>in order to</w:t>
+      </w:r>
+      <w:proofErr w:type="gramEnd"/>
+      <w:r>
+        <w:t xml:space="preserve"> merge existing users and addresses, these are usually always filled out so I think we need to stick with these:</w:t>
       </w:r>
     </w:p>
     <w:p>
@@ -3812,6 +4221,7 @@
         <w:pStyle w:val="NoSpacing"/>
       </w:pPr>
       <w:r>
+        <w:lastRenderedPageBreak/>
         <w:t>Also, allow them to choose other data from either source or target.  Always remove true duplicates from source prior to loading into new system, but everything must match including internal ids</w:t>
       </w:r>
     </w:p>
@@ -3877,6 +4287,7 @@
         <w:t xml:space="preserve">Can I auto populate BA Types, e.g. jib/rev/vendor, etc. – for </w:t>
       </w:r>
       <w:proofErr w:type="spellStart"/>
+      <w:proofErr w:type="gramStart"/>
       <w:r>
         <w:t>Enertia</w:t>
       </w:r>
@@ -3889,6 +4300,7 @@
         <w:t>Enertia</w:t>
       </w:r>
       <w:proofErr w:type="spellEnd"/>
+      <w:proofErr w:type="gramEnd"/>
       <w:r>
         <w:t xml:space="preserve"> conversions </w:t>
       </w:r>
@@ -5062,7 +5474,6 @@
                 <w:szCs w:val="22"/>
                 <w14:ligatures w14:val="none"/>
               </w:rPr>
-              <w:lastRenderedPageBreak/>
               <w:t>CORRESPOND</w:t>
             </w:r>
           </w:p>
@@ -5414,6 +5825,7 @@
         <w:rPr>
           <w:noProof/>
         </w:rPr>
+        <w:lastRenderedPageBreak/>
         <w:drawing>
           <wp:inline distT="0" distB="0" distL="0" distR="0" wp14:anchorId="152BA910" wp14:editId="2D538599">
             <wp:extent cx="5943600" cy="3039745"/>
@@ -5430,7 +5842,7 @@
                     <pic:cNvPicPr/>
                   </pic:nvPicPr>
                   <pic:blipFill>
-                    <a:blip r:embed="rId31"/>
+                    <a:blip r:embed="rId34"/>
                     <a:stretch>
                       <a:fillRect/>
                     </a:stretch>
@@ -5490,7 +5902,7 @@
                     <pic:cNvPicPr/>
                   </pic:nvPicPr>
                   <pic:blipFill>
-                    <a:blip r:embed="rId32"/>
+                    <a:blip r:embed="rId35"/>
                     <a:stretch>
                       <a:fillRect/>
                     </a:stretch>
@@ -5548,7 +5960,7 @@
                     <pic:cNvPicPr/>
                   </pic:nvPicPr>
                   <pic:blipFill>
-                    <a:blip r:embed="rId33"/>
+                    <a:blip r:embed="rId36"/>
                     <a:stretch>
                       <a:fillRect/>
                     </a:stretch>
@@ -5606,7 +6018,7 @@
                     <pic:cNvPicPr/>
                   </pic:nvPicPr>
                   <pic:blipFill>
-                    <a:blip r:embed="rId34"/>
+                    <a:blip r:embed="rId37"/>
                     <a:stretch>
                       <a:fillRect/>
                     </a:stretch>
@@ -5700,8 +6112,13 @@
       </w:r>
       <w:proofErr w:type="spellEnd"/>
       <w:r>
-        <w:t xml:space="preserve"> new address must be  strict</w:t>
-      </w:r>
+        <w:t xml:space="preserve"> new address must </w:t>
+      </w:r>
+      <w:proofErr w:type="gramStart"/>
+      <w:r>
+        <w:t>be  strict</w:t>
+      </w:r>
+      <w:proofErr w:type="gramEnd"/>
     </w:p>
     <w:p>
       <w:pPr>
@@ -5727,7 +6144,7 @@
                     <pic:cNvPicPr/>
                   </pic:nvPicPr>
                   <pic:blipFill>
-                    <a:blip r:embed="rId35"/>
+                    <a:blip r:embed="rId38"/>
                     <a:stretch>
                       <a:fillRect/>
                     </a:stretch>
@@ -5879,7 +6296,15 @@
         </w:numPr>
       </w:pPr>
       <w:r>
-        <w:t>Ambiguous name scores (15–50) get sent to Claude Sonnet AI for a second opinion — "Do these business names refer to the same entity?" — overrides the score if AI disagrees</w:t>
+        <w:t xml:space="preserve">Ambiguous name scores (15–50) get sent to Claude Sonnet AI for a second opinion — "Do </w:t>
+      </w:r>
+      <w:proofErr w:type="gramStart"/>
+      <w:r>
+        <w:t>these business</w:t>
+      </w:r>
+      <w:proofErr w:type="gramEnd"/>
+      <w:r>
+        <w:t xml:space="preserve"> names refer to the same entity?" — overrides the score if AI disagrees</w:t>
       </w:r>
     </w:p>
     <w:p>
@@ -5894,7 +6319,15 @@
         <w:t>Address Scoring (bottom row, left to right)</w:t>
       </w:r>
       <w:r>
-        <w:t xml:space="preserve"> 4. Addresses are normalized — PO Box variants unified, street abbreviations standardized, dates stripped from address fields (data quality issue in source) 5. Address comparison has three paths: PO Box, Street, and Non-Standard (military addresses) — each with its own scoring formula combining street similarity and city similarity 6. Ambiguous address scores (15–65) get validated through Google's Address Validation API — both Canvas and DEC addresses are standardized, then re-scored. Persistent cache means zero API calls on re-runs</w:t>
+        <w:t xml:space="preserve"> 4. Addresses are normalized — PO Box variants unified, street abbreviations standardized, dates stripped from address fields (data quality issue in source) 5. Address comparison has three paths: PO Box, Street, and Non-Standard (military </w:t>
+      </w:r>
+      <w:proofErr w:type="gramStart"/>
+      <w:r>
+        <w:t>addresses) —</w:t>
+      </w:r>
+      <w:proofErr w:type="gramEnd"/>
+      <w:r>
+        <w:t xml:space="preserve"> each with its own scoring formula combining street similarity and city similarity 6. Ambiguous address scores (15–65) get validated through Google's Address Validation API — both Canvas and DEC addresses are standardized, then re-scored. Persistent cache means zero API calls on re-runs</w:t>
       </w:r>
     </w:p>
     <w:p>
@@ -5924,11 +6357,7 @@
         <w:t>Decision Priority (bottom legend)</w:t>
       </w:r>
       <w:r>
-        <w:t xml:space="preserve"> 9. Classification follows a strict priority order — API overrides first, then score thresholds, checked top-to-bottom, first match wins 10. All </w:t>
-      </w:r>
-      <w:r>
-        <w:lastRenderedPageBreak/>
-        <w:t>scores are rounded to nearest 5. Human review is mandatory — no auto-merge. The system recommends, humans decide</w:t>
+        <w:t xml:space="preserve"> 9. Classification follows a strict priority order — API overrides first, then score thresholds, checked top-to-bottom, first match wins 10. All scores are rounded to nearest 5. Human review is mandatory — no auto-merge. The system recommends, humans decide</w:t>
       </w:r>
     </w:p>
     <w:p>
@@ -5964,7 +6393,15 @@
         </w:numPr>
       </w:pPr>
       <w:r>
-        <w:t>Persistent caching = cost-controlled (no redundant API calls)</w:t>
+        <w:t xml:space="preserve">Persistent </w:t>
+      </w:r>
+      <w:proofErr w:type="gramStart"/>
+      <w:r>
+        <w:t>caching</w:t>
+      </w:r>
+      <w:proofErr w:type="gramEnd"/>
+      <w:r>
+        <w:t xml:space="preserve"> = cost-controlled (no redundant API calls)</w:t>
       </w:r>
     </w:p>
     <w:p>
@@ -6066,6 +6503,7 @@
         </w:numPr>
       </w:pPr>
       <w:r>
+        <w:lastRenderedPageBreak/>
         <w:t xml:space="preserve">"This tool reviews and processes BA/address matches between Canvas and </w:t>
       </w:r>
       <w:proofErr w:type="spellStart"/>
@@ -6270,7 +6708,23 @@
         </w:numPr>
       </w:pPr>
       <w:r>
-        <w:t>"Orange-highlighted rows flag records containing 'trust' — draws attention for manual review"</w:t>
+        <w:t>"Orange-highlighted rows flag records containing '</w:t>
+      </w:r>
+      <w:proofErr w:type="gramStart"/>
+      <w:r>
+        <w:t>trust' —</w:t>
+      </w:r>
+      <w:proofErr w:type="gramEnd"/>
+      <w:r>
+        <w:t xml:space="preserve"> </w:t>
+      </w:r>
+      <w:proofErr w:type="gramStart"/>
+      <w:r>
+        <w:t>draws</w:t>
+      </w:r>
+      <w:proofErr w:type="gramEnd"/>
+      <w:r>
+        <w:t xml:space="preserve"> attention for manual review"</w:t>
       </w:r>
     </w:p>
     <w:p>
@@ -6362,7 +6816,15 @@
         </w:numPr>
       </w:pPr>
       <w:r>
-        <w:t>"Or use the edit modal for detailed side-by-side Canvas vs DEC comparison"</w:t>
+        <w:t xml:space="preserve">"Or use the edit </w:t>
+      </w:r>
+      <w:proofErr w:type="gramStart"/>
+      <w:r>
+        <w:t>modal</w:t>
+      </w:r>
+      <w:proofErr w:type="gramEnd"/>
+      <w:r>
+        <w:t xml:space="preserve"> for detailed side-by-side Canvas vs DEC comparison"</w:t>
       </w:r>
     </w:p>
     <w:p>
@@ -6402,7 +6864,6 @@
           <w:b/>
           <w:bCs/>
         </w:rPr>
-        <w:lastRenderedPageBreak/>
         <w:t>8. Data Management</w:t>
       </w:r>
     </w:p>
@@ -6661,6 +7122,95 @@
     </w:lvl>
   </w:abstractNum>
   <w:abstractNum w:abstractNumId="1" w15:restartNumberingAfterBreak="0">
+    <w:nsid w:val="028254FE"/>
+    <w:multiLevelType w:val="hybridMultilevel"/>
+    <w:tmpl w:val="480C8308"/>
+    <w:lvl w:ilvl="0" w:tplc="0409000F">
+      <w:start w:val="1"/>
+      <w:numFmt w:val="decimal"/>
+      <w:lvlText w:val="%1."/>
+      <w:lvlJc w:val="left"/>
+      <w:pPr>
+        <w:ind w:left="720" w:hanging="360"/>
+      </w:pPr>
+      <w:rPr>
+        <w:rFonts w:hint="default"/>
+      </w:rPr>
+    </w:lvl>
+    <w:lvl w:ilvl="1" w:tplc="04090019" w:tentative="1">
+      <w:start w:val="1"/>
+      <w:numFmt w:val="lowerLetter"/>
+      <w:lvlText w:val="%2."/>
+      <w:lvlJc w:val="left"/>
+      <w:pPr>
+        <w:ind w:left="1440" w:hanging="360"/>
+      </w:pPr>
+    </w:lvl>
+    <w:lvl w:ilvl="2" w:tplc="0409001B" w:tentative="1">
+      <w:start w:val="1"/>
+      <w:numFmt w:val="lowerRoman"/>
+      <w:lvlText w:val="%3."/>
+      <w:lvlJc w:val="right"/>
+      <w:pPr>
+        <w:ind w:left="2160" w:hanging="180"/>
+      </w:pPr>
+    </w:lvl>
+    <w:lvl w:ilvl="3" w:tplc="0409000F" w:tentative="1">
+      <w:start w:val="1"/>
+      <w:numFmt w:val="decimal"/>
+      <w:lvlText w:val="%4."/>
+      <w:lvlJc w:val="left"/>
+      <w:pPr>
+        <w:ind w:left="2880" w:hanging="360"/>
+      </w:pPr>
+    </w:lvl>
+    <w:lvl w:ilvl="4" w:tplc="04090019" w:tentative="1">
+      <w:start w:val="1"/>
+      <w:numFmt w:val="lowerLetter"/>
+      <w:lvlText w:val="%5."/>
+      <w:lvlJc w:val="left"/>
+      <w:pPr>
+        <w:ind w:left="3600" w:hanging="360"/>
+      </w:pPr>
+    </w:lvl>
+    <w:lvl w:ilvl="5" w:tplc="0409001B" w:tentative="1">
+      <w:start w:val="1"/>
+      <w:numFmt w:val="lowerRoman"/>
+      <w:lvlText w:val="%6."/>
+      <w:lvlJc w:val="right"/>
+      <w:pPr>
+        <w:ind w:left="4320" w:hanging="180"/>
+      </w:pPr>
+    </w:lvl>
+    <w:lvl w:ilvl="6" w:tplc="0409000F" w:tentative="1">
+      <w:start w:val="1"/>
+      <w:numFmt w:val="decimal"/>
+      <w:lvlText w:val="%7."/>
+      <w:lvlJc w:val="left"/>
+      <w:pPr>
+        <w:ind w:left="5040" w:hanging="360"/>
+      </w:pPr>
+    </w:lvl>
+    <w:lvl w:ilvl="7" w:tplc="04090019" w:tentative="1">
+      <w:start w:val="1"/>
+      <w:numFmt w:val="lowerLetter"/>
+      <w:lvlText w:val="%8."/>
+      <w:lvlJc w:val="left"/>
+      <w:pPr>
+        <w:ind w:left="5760" w:hanging="360"/>
+      </w:pPr>
+    </w:lvl>
+    <w:lvl w:ilvl="8" w:tplc="0409001B" w:tentative="1">
+      <w:start w:val="1"/>
+      <w:numFmt w:val="lowerRoman"/>
+      <w:lvlText w:val="%9."/>
+      <w:lvlJc w:val="right"/>
+      <w:pPr>
+        <w:ind w:left="6480" w:hanging="180"/>
+      </w:pPr>
+    </w:lvl>
+  </w:abstractNum>
+  <w:abstractNum w:abstractNumId="2" w15:restartNumberingAfterBreak="0">
     <w:nsid w:val="18A47FD6"/>
     <w:multiLevelType w:val="multilevel"/>
     <w:tmpl w:val="23829252"/>
@@ -6809,7 +7359,7 @@
       </w:rPr>
     </w:lvl>
   </w:abstractNum>
-  <w:abstractNum w:abstractNumId="2" w15:restartNumberingAfterBreak="0">
+  <w:abstractNum w:abstractNumId="3" w15:restartNumberingAfterBreak="0">
     <w:nsid w:val="19AF7DBF"/>
     <w:multiLevelType w:val="multilevel"/>
     <w:tmpl w:val="A672151C"/>
@@ -6922,7 +7472,7 @@
       </w:pPr>
     </w:lvl>
   </w:abstractNum>
-  <w:abstractNum w:abstractNumId="3" w15:restartNumberingAfterBreak="0">
+  <w:abstractNum w:abstractNumId="4" w15:restartNumberingAfterBreak="0">
     <w:nsid w:val="1A892613"/>
     <w:multiLevelType w:val="multilevel"/>
     <w:tmpl w:val="9CEA3C4A"/>
@@ -7071,7 +7621,7 @@
       </w:rPr>
     </w:lvl>
   </w:abstractNum>
-  <w:abstractNum w:abstractNumId="4" w15:restartNumberingAfterBreak="0">
+  <w:abstractNum w:abstractNumId="5" w15:restartNumberingAfterBreak="0">
     <w:nsid w:val="37B00B2E"/>
     <w:multiLevelType w:val="multilevel"/>
     <w:tmpl w:val="4EE04E0C"/>
@@ -7220,7 +7770,7 @@
       </w:rPr>
     </w:lvl>
   </w:abstractNum>
-  <w:abstractNum w:abstractNumId="5" w15:restartNumberingAfterBreak="0">
+  <w:abstractNum w:abstractNumId="6" w15:restartNumberingAfterBreak="0">
     <w:nsid w:val="39BD4972"/>
     <w:multiLevelType w:val="multilevel"/>
     <w:tmpl w:val="E2124C86"/>
@@ -7369,7 +7919,7 @@
       </w:rPr>
     </w:lvl>
   </w:abstractNum>
-  <w:abstractNum w:abstractNumId="6" w15:restartNumberingAfterBreak="0">
+  <w:abstractNum w:abstractNumId="7" w15:restartNumberingAfterBreak="0">
     <w:nsid w:val="3B0E4841"/>
     <w:multiLevelType w:val="multilevel"/>
     <w:tmpl w:val="3306D9EE"/>
@@ -7518,7 +8068,7 @@
       </w:rPr>
     </w:lvl>
   </w:abstractNum>
-  <w:abstractNum w:abstractNumId="7" w15:restartNumberingAfterBreak="0">
+  <w:abstractNum w:abstractNumId="8" w15:restartNumberingAfterBreak="0">
     <w:nsid w:val="4CF05109"/>
     <w:multiLevelType w:val="multilevel"/>
     <w:tmpl w:val="F840614A"/>
@@ -7667,7 +8217,7 @@
       </w:rPr>
     </w:lvl>
   </w:abstractNum>
-  <w:abstractNum w:abstractNumId="8" w15:restartNumberingAfterBreak="0">
+  <w:abstractNum w:abstractNumId="9" w15:restartNumberingAfterBreak="0">
     <w:nsid w:val="56FE0E20"/>
     <w:multiLevelType w:val="hybridMultilevel"/>
     <w:tmpl w:val="6EC04ECA"/>
@@ -7780,7 +8330,7 @@
       </w:rPr>
     </w:lvl>
   </w:abstractNum>
-  <w:abstractNum w:abstractNumId="9" w15:restartNumberingAfterBreak="0">
+  <w:abstractNum w:abstractNumId="10" w15:restartNumberingAfterBreak="0">
     <w:nsid w:val="68512BA7"/>
     <w:multiLevelType w:val="multilevel"/>
     <w:tmpl w:val="A9CA261E"/>
@@ -7929,7 +8479,7 @@
       </w:rPr>
     </w:lvl>
   </w:abstractNum>
-  <w:abstractNum w:abstractNumId="10" w15:restartNumberingAfterBreak="0">
+  <w:abstractNum w:abstractNumId="11" w15:restartNumberingAfterBreak="0">
     <w:nsid w:val="6C7E7EBC"/>
     <w:multiLevelType w:val="multilevel"/>
     <w:tmpl w:val="94306474"/>
@@ -8078,7 +8628,7 @@
       </w:rPr>
     </w:lvl>
   </w:abstractNum>
-  <w:abstractNum w:abstractNumId="11" w15:restartNumberingAfterBreak="0">
+  <w:abstractNum w:abstractNumId="12" w15:restartNumberingAfterBreak="0">
     <w:nsid w:val="7B02499D"/>
     <w:multiLevelType w:val="hybridMultilevel"/>
     <w:tmpl w:val="30E674B6"/>
@@ -8167,7 +8717,7 @@
       </w:pPr>
     </w:lvl>
   </w:abstractNum>
-  <w:abstractNum w:abstractNumId="12" w15:restartNumberingAfterBreak="0">
+  <w:abstractNum w:abstractNumId="13" w15:restartNumberingAfterBreak="0">
     <w:nsid w:val="7B7A4C78"/>
     <w:multiLevelType w:val="multilevel"/>
     <w:tmpl w:val="D264E08C"/>
@@ -8317,43 +8867,46 @@
     </w:lvl>
   </w:abstractNum>
   <w:num w:numId="1" w16cid:durableId="1524202000">
-    <w:abstractNumId w:val="8"/>
+    <w:abstractNumId w:val="9"/>
   </w:num>
   <w:num w:numId="2" w16cid:durableId="146557319">
-    <w:abstractNumId w:val="2"/>
+    <w:abstractNumId w:val="3"/>
   </w:num>
   <w:num w:numId="3" w16cid:durableId="1677920749">
     <w:abstractNumId w:val="0"/>
   </w:num>
   <w:num w:numId="4" w16cid:durableId="1508137107">
+    <w:abstractNumId w:val="8"/>
+  </w:num>
+  <w:num w:numId="5" w16cid:durableId="1534224815">
+    <w:abstractNumId w:val="5"/>
+  </w:num>
+  <w:num w:numId="6" w16cid:durableId="727999587">
+    <w:abstractNumId w:val="4"/>
+  </w:num>
+  <w:num w:numId="7" w16cid:durableId="250086959">
+    <w:abstractNumId w:val="13"/>
+  </w:num>
+  <w:num w:numId="8" w16cid:durableId="400366779">
+    <w:abstractNumId w:val="11"/>
+  </w:num>
+  <w:num w:numId="9" w16cid:durableId="1359893903">
+    <w:abstractNumId w:val="10"/>
+  </w:num>
+  <w:num w:numId="10" w16cid:durableId="1727026266">
+    <w:abstractNumId w:val="2"/>
+  </w:num>
+  <w:num w:numId="11" w16cid:durableId="526719362">
+    <w:abstractNumId w:val="6"/>
+  </w:num>
+  <w:num w:numId="12" w16cid:durableId="68817628">
     <w:abstractNumId w:val="7"/>
   </w:num>
-  <w:num w:numId="5" w16cid:durableId="1534224815">
-    <w:abstractNumId w:val="4"/>
-  </w:num>
-  <w:num w:numId="6" w16cid:durableId="727999587">
-    <w:abstractNumId w:val="3"/>
-  </w:num>
-  <w:num w:numId="7" w16cid:durableId="250086959">
+  <w:num w:numId="13" w16cid:durableId="456722028">
     <w:abstractNumId w:val="12"/>
   </w:num>
-  <w:num w:numId="8" w16cid:durableId="400366779">
-    <w:abstractNumId w:val="10"/>
-  </w:num>
-  <w:num w:numId="9" w16cid:durableId="1359893903">
-    <w:abstractNumId w:val="9"/>
-  </w:num>
-  <w:num w:numId="10" w16cid:durableId="1727026266">
+  <w:num w:numId="14" w16cid:durableId="1744640092">
     <w:abstractNumId w:val="1"/>
-  </w:num>
-  <w:num w:numId="11" w16cid:durableId="526719362">
-    <w:abstractNumId w:val="5"/>
-  </w:num>
-  <w:num w:numId="12" w16cid:durableId="68817628">
-    <w:abstractNumId w:val="6"/>
-  </w:num>
-  <w:num w:numId="13" w16cid:durableId="456722028">
-    <w:abstractNumId w:val="11"/>
   </w:num>
 </w:numbering>
 </file>

</xml_diff>

<commit_message>
Add staging workflow, bulk Process update, SSN columns, column renames
- Add Stage Approved button: copies APPROVED+Process records to staging table, flags as STAGED
- New endpoints: /api/bulk_field_update, /api/staging_count, /api/stage_approved
- STAGED records hidden by default, read-only when viewed, purple badge
- Bulk Process dropdown applies to entire shift-selected range via single API call
- Add Src SSN and DEC SSN columns; rename Source -> Src headers
- Shift-select uses row-index for stability across virtual scrolling
- Auto-create IMPORT_MERGE_STAGING table in ensure_snowflake_schema
- Add DEPLOYMENT.md with production deployment guide

Co-Authored-By: Claude Opus 4.6 <noreply@anthropic.com>
</commit_message>
<xml_diff>
--- a/Things to consider.docx
+++ b/Things to consider.docx
@@ -2,6 +2,120 @@
 <file path=word/document.xml><?xml version="1.0" encoding="utf-8"?>
 <w:document xmlns:wpc="http://schemas.microsoft.com/office/word/2010/wordprocessingCanvas" xmlns:cx="http://schemas.microsoft.com/office/drawing/2014/chartex" xmlns:cx1="http://schemas.microsoft.com/office/drawing/2015/9/8/chartex" xmlns:cx2="http://schemas.microsoft.com/office/drawing/2015/10/21/chartex" xmlns:cx3="http://schemas.microsoft.com/office/drawing/2016/5/9/chartex" xmlns:cx4="http://schemas.microsoft.com/office/drawing/2016/5/10/chartex" xmlns:cx5="http://schemas.microsoft.com/office/drawing/2016/5/11/chartex" xmlns:cx6="http://schemas.microsoft.com/office/drawing/2016/5/12/chartex" xmlns:cx7="http://schemas.microsoft.com/office/drawing/2016/5/13/chartex" xmlns:cx8="http://schemas.microsoft.com/office/drawing/2016/5/14/chartex" xmlns:mc="http://schemas.openxmlformats.org/markup-compatibility/2006" xmlns:aink="http://schemas.microsoft.com/office/drawing/2016/ink" xmlns:am3d="http://schemas.microsoft.com/office/drawing/2017/model3d" xmlns:o="urn:schemas-microsoft-com:office:office" xmlns:oel="http://schemas.microsoft.com/office/2019/extlst" xmlns:r="http://schemas.openxmlformats.org/officeDocument/2006/relationships" xmlns:m="http://schemas.openxmlformats.org/officeDocument/2006/math" xmlns:v="urn:schemas-microsoft-com:vml" xmlns:wp14="http://schemas.microsoft.com/office/word/2010/wordprocessingDrawing" xmlns:wp="http://schemas.openxmlformats.org/drawingml/2006/wordprocessingDrawing" xmlns:w10="urn:schemas-microsoft-com:office:word" xmlns:w="http://schemas.openxmlformats.org/wordprocessingml/2006/main" xmlns:w14="http://schemas.microsoft.com/office/word/2010/wordml" xmlns:w15="http://schemas.microsoft.com/office/word/2012/wordml" xmlns:w16cex="http://schemas.microsoft.com/office/word/2018/wordml/cex" xmlns:w16cid="http://schemas.microsoft.com/office/word/2016/wordml/cid" xmlns:w16="http://schemas.microsoft.com/office/word/2018/wordml" xmlns:w16du="http://schemas.microsoft.com/office/word/2023/wordml/word16du" xmlns:w16sdtdh="http://schemas.microsoft.com/office/word/2020/wordml/sdtdatahash" xmlns:w16sdtfl="http://schemas.microsoft.com/office/word/2024/wordml/sdtformatlock" xmlns:w16se="http://schemas.microsoft.com/office/word/2015/wordml/symex" xmlns:wpg="http://schemas.microsoft.com/office/word/2010/wordprocessingGroup" xmlns:wpi="http://schemas.microsoft.com/office/word/2010/wordprocessingInk" xmlns:wne="http://schemas.microsoft.com/office/word/2006/wordml" xmlns:wps="http://schemas.microsoft.com/office/word/2010/wordprocessingShape" mc:Ignorable="w14 w15 w16se w16cid w16 w16cex w16sdtdh w16sdtfl w16du wp14">
   <w:body>
+    <w:p>
+      <w:pPr>
+        <w:ind w:left="720" w:hanging="360"/>
+      </w:pPr>
+      <w:r>
+        <w:drawing>
+          <wp:inline distT="0" distB="0" distL="0" distR="0" wp14:anchorId="00E766D1" wp14:editId="411D0038">
+            <wp:extent cx="5943600" cy="184785"/>
+            <wp:effectExtent l="0" t="0" r="0" b="5715"/>
+            <wp:docPr id="2099288547" name="Picture 1"/>
+            <wp:cNvGraphicFramePr>
+              <a:graphicFrameLocks xmlns:a="http://schemas.openxmlformats.org/drawingml/2006/main" noChangeAspect="1"/>
+            </wp:cNvGraphicFramePr>
+            <a:graphic xmlns:a="http://schemas.openxmlformats.org/drawingml/2006/main">
+              <a:graphicData uri="http://schemas.openxmlformats.org/drawingml/2006/picture">
+                <pic:pic xmlns:pic="http://schemas.openxmlformats.org/drawingml/2006/picture">
+                  <pic:nvPicPr>
+                    <pic:cNvPr id="2099288547" name=""/>
+                    <pic:cNvPicPr/>
+                  </pic:nvPicPr>
+                  <pic:blipFill>
+                    <a:blip r:embed="rId5"/>
+                    <a:stretch>
+                      <a:fillRect/>
+                    </a:stretch>
+                  </pic:blipFill>
+                  <pic:spPr>
+                    <a:xfrm>
+                      <a:off x="0" y="0"/>
+                      <a:ext cx="5943600" cy="184785"/>
+                    </a:xfrm>
+                    <a:prstGeom prst="rect">
+                      <a:avLst/>
+                    </a:prstGeom>
+                  </pic:spPr>
+                </pic:pic>
+              </a:graphicData>
+            </a:graphic>
+          </wp:inline>
+        </w:drawing>
+      </w:r>
+    </w:p>
+    <w:p>
+      <w:pPr>
+        <w:ind w:left="720" w:hanging="360"/>
+        <w:rPr>
+          <w:b/>
+          <w:bCs/>
+        </w:rPr>
+      </w:pPr>
+      <w:r>
+        <w:rPr>
+          <w:b/>
+          <w:bCs/>
+        </w:rPr>
+        <w:drawing>
+          <wp:inline distT="0" distB="0" distL="0" distR="0" wp14:anchorId="14F90506" wp14:editId="7DE45354">
+            <wp:extent cx="5943600" cy="2861945"/>
+            <wp:effectExtent l="0" t="0" r="0" b="0"/>
+            <wp:docPr id="129153386" name="Picture 1"/>
+            <wp:cNvGraphicFramePr>
+              <a:graphicFrameLocks xmlns:a="http://schemas.openxmlformats.org/drawingml/2006/main" noChangeAspect="1"/>
+            </wp:cNvGraphicFramePr>
+            <a:graphic xmlns:a="http://schemas.openxmlformats.org/drawingml/2006/main">
+              <a:graphicData uri="http://schemas.openxmlformats.org/drawingml/2006/picture">
+                <pic:pic xmlns:pic="http://schemas.openxmlformats.org/drawingml/2006/picture">
+                  <pic:nvPicPr>
+                    <pic:cNvPr id="129153386" name=""/>
+                    <pic:cNvPicPr/>
+                  </pic:nvPicPr>
+                  <pic:blipFill>
+                    <a:blip r:embed="rId6"/>
+                    <a:stretch>
+                      <a:fillRect/>
+                    </a:stretch>
+                  </pic:blipFill>
+                  <pic:spPr>
+                    <a:xfrm>
+                      <a:off x="0" y="0"/>
+                      <a:ext cx="5943600" cy="2861945"/>
+                    </a:xfrm>
+                    <a:prstGeom prst="rect">
+                      <a:avLst/>
+                    </a:prstGeom>
+                  </pic:spPr>
+                </pic:pic>
+              </a:graphicData>
+            </a:graphic>
+          </wp:inline>
+        </w:drawing>
+      </w:r>
+    </w:p>
+    <w:p>
+      <w:pPr>
+        <w:ind w:left="720" w:hanging="360"/>
+      </w:pPr>
+      <w:r>
+        <w:t>Yes</w:t>
+      </w:r>
+    </w:p>
+    <w:p>
+      <w:pPr>
+        <w:ind w:left="720" w:hanging="360"/>
+      </w:pPr>
+      <w:r>
+        <w:t>No</w:t>
+      </w:r>
+    </w:p>
+    <w:p>
+      <w:r>
+        <w:t xml:space="preserve">       </w:t>
+      </w:r>
+    </w:p>
+    <w:p/>
     <w:p>
       <w:pPr>
         <w:pStyle w:val="ListParagraph"/>
@@ -10,17 +124,6 @@
           <w:numId w:val="14"/>
         </w:numPr>
       </w:pPr>
-      <w:r>
-        <w:t xml:space="preserve">Mismatch on </w:t>
-      </w:r>
-      <w:proofErr w:type="spellStart"/>
-      <w:r>
-        <w:t>ssn</w:t>
-      </w:r>
-      <w:proofErr w:type="spellEnd"/>
-      <w:r>
-        <w:t xml:space="preserve"> or missing on either</w:t>
-      </w:r>
     </w:p>
     <w:p>
       <w:pPr>
@@ -31,15 +134,7 @@
         </w:numPr>
       </w:pPr>
       <w:r>
-        <w:t xml:space="preserve">Warn on close if there are pending saves. Or run code to </w:t>
-      </w:r>
-      <w:proofErr w:type="spellStart"/>
-      <w:r>
-        <w:t>upate</w:t>
-      </w:r>
-      <w:proofErr w:type="spellEnd"/>
-      <w:r>
-        <w:t xml:space="preserve"> save changes count on button when opening.</w:t>
+        <w:t>Mismatch on ssn or missing on either</w:t>
       </w:r>
     </w:p>
     <w:p>
@@ -51,6 +146,18 @@
         </w:numPr>
       </w:pPr>
       <w:r>
+        <w:t>Warn on close if there are pending saves. Or run code to upate save changes count on button when opening.</w:t>
+      </w:r>
+    </w:p>
+    <w:p>
+      <w:pPr>
+        <w:pStyle w:val="ListParagraph"/>
+        <w:numPr>
+          <w:ilvl w:val="0"/>
+          <w:numId w:val="14"/>
+        </w:numPr>
+      </w:pPr>
+      <w:r>
         <w:t>Feedback loop.  Multiple time through</w:t>
       </w:r>
     </w:p>
@@ -59,37 +166,8 @@
       <w:pPr>
         <w:ind w:left="720" w:hanging="360"/>
       </w:pPr>
-      <w:proofErr w:type="gramStart"/>
-      <w:r>
-        <w:t>Need</w:t>
-      </w:r>
-      <w:proofErr w:type="gramEnd"/>
-      <w:r>
-        <w:t xml:space="preserve"> to talk about Source address (addraddr1+2). Extra fields like nam1, 2, 3. Phone, fax, email, </w:t>
-      </w:r>
-      <w:proofErr w:type="spellStart"/>
-      <w:r>
-        <w:t>addrnonresident</w:t>
-      </w:r>
-      <w:proofErr w:type="spellEnd"/>
-      <w:r>
-        <w:t xml:space="preserve">, </w:t>
-      </w:r>
-      <w:proofErr w:type="spellStart"/>
-      <w:r>
-        <w:t>is_corp</w:t>
-      </w:r>
-      <w:proofErr w:type="spellEnd"/>
-      <w:r>
-        <w:t xml:space="preserve">, </w:t>
-      </w:r>
-      <w:proofErr w:type="spellStart"/>
-      <w:r>
-        <w:t>entity_list_name</w:t>
-      </w:r>
-      <w:proofErr w:type="spellEnd"/>
-      <w:r>
-        <w:t>, ACH fields, etc.</w:t>
+      <w:r>
+        <w:t>Need to talk about Source address (addraddr1+2). Extra fields like nam1, 2, 3. Phone, fax, email, addrnonresident, is_corp, entity_list_name, ACH fields, etc.</w:t>
       </w:r>
     </w:p>
     <w:p>
@@ -102,23 +180,7 @@
         <w:ind w:left="720" w:hanging="360"/>
       </w:pPr>
       <w:r>
-        <w:t xml:space="preserve">Done. Added a custom </w:t>
-      </w:r>
-      <w:proofErr w:type="spellStart"/>
-      <w:r>
-        <w:t>cellRenderer</w:t>
-      </w:r>
-      <w:proofErr w:type="spellEnd"/>
-      <w:r>
-        <w:t xml:space="preserve"> to the Source </w:t>
-      </w:r>
-      <w:proofErr w:type="spellStart"/>
-      <w:r>
-        <w:t>Addr</w:t>
-      </w:r>
-      <w:proofErr w:type="spellEnd"/>
-      <w:r>
-        <w:t xml:space="preserve"> column that splits the value by lines and renders characters past position 45 on each line in red. Lines at or under 45 characters display normally. Hard refresh to see the change.</w:t>
+        <w:t>Done. Added a custom cellRenderer to the Source Addr column that splits the value by lines and renders characters past position 45 on each line in red. Lines at or under 45 characters display normally. Hard refresh to see the change.</w:t>
       </w:r>
     </w:p>
     <w:p>
@@ -126,17 +188,7 @@
         <w:ind w:left="720" w:hanging="360"/>
       </w:pPr>
       <w:r>
-        <w:t xml:space="preserve">No </w:t>
-      </w:r>
-      <w:proofErr w:type="spellStart"/>
-      <w:proofErr w:type="gramStart"/>
-      <w:r>
-        <w:t>SSN,Duplicate</w:t>
-      </w:r>
-      <w:proofErr w:type="spellEnd"/>
-      <w:proofErr w:type="gramEnd"/>
-      <w:r>
-        <w:t xml:space="preserve"> address</w:t>
+        <w:t>No SSN,Duplicate address</w:t>
       </w:r>
     </w:p>
     <w:p>
@@ -163,7 +215,7 @@
                     <pic:cNvPicPr/>
                   </pic:nvPicPr>
                   <pic:blipFill>
-                    <a:blip r:embed="rId5"/>
+                    <a:blip r:embed="rId7"/>
                     <a:stretch>
                       <a:fillRect/>
                     </a:stretch>
@@ -192,6 +244,7 @@
         <w:rPr>
           <w:noProof/>
         </w:rPr>
+        <w:lastRenderedPageBreak/>
         <w:drawing>
           <wp:inline distT="0" distB="0" distL="0" distR="0" wp14:anchorId="534540EB" wp14:editId="693B4DCE">
             <wp:extent cx="5943600" cy="262890"/>
@@ -208,7 +261,7 @@
                     <pic:cNvPicPr/>
                   </pic:nvPicPr>
                   <pic:blipFill>
-                    <a:blip r:embed="rId6"/>
+                    <a:blip r:embed="rId8"/>
                     <a:stretch>
                       <a:fillRect/>
                     </a:stretch>
@@ -253,7 +306,7 @@
                     <pic:cNvPicPr/>
                   </pic:nvPicPr>
                   <pic:blipFill>
-                    <a:blip r:embed="rId7"/>
+                    <a:blip r:embed="rId9"/>
                     <a:stretch>
                       <a:fillRect/>
                     </a:stretch>
@@ -306,15 +359,7 @@
         </w:numPr>
       </w:pPr>
       <w:r>
-        <w:t xml:space="preserve">Work with </w:t>
-      </w:r>
-      <w:proofErr w:type="gramStart"/>
-      <w:r>
-        <w:t>client</w:t>
-      </w:r>
-      <w:proofErr w:type="gramEnd"/>
-      <w:r>
-        <w:t xml:space="preserve"> </w:t>
+        <w:t xml:space="preserve">Work with client </w:t>
       </w:r>
       <w:r>
         <w:t>to load source, give template</w:t>
@@ -332,15 +377,8 @@
         </w:numPr>
       </w:pPr>
       <w:r>
-        <w:t xml:space="preserve">Think about how delta data works, on new </w:t>
-      </w:r>
-      <w:proofErr w:type="spellStart"/>
-      <w:proofErr w:type="gramStart"/>
-      <w:r>
-        <w:t>datasources</w:t>
-      </w:r>
-      <w:proofErr w:type="spellEnd"/>
-      <w:proofErr w:type="gramEnd"/>
+        <w:t>Think about how delta data works, on new datasources</w:t>
+      </w:r>
       <w:r>
         <w:t>.</w:t>
       </w:r>
@@ -353,13 +391,8 @@
           <w:numId w:val="13"/>
         </w:numPr>
       </w:pPr>
-      <w:proofErr w:type="gramStart"/>
-      <w:r>
-        <w:t>Meet with</w:t>
-      </w:r>
-      <w:proofErr w:type="gramEnd"/>
-      <w:r>
-        <w:t xml:space="preserve"> Steve on MVP</w:t>
+      <w:r>
+        <w:t>Meet with Steve on MVP</w:t>
       </w:r>
       <w:r>
         <w:t>.</w:t>
@@ -373,29 +406,8 @@
           <w:numId w:val="13"/>
         </w:numPr>
       </w:pPr>
-      <w:proofErr w:type="gramStart"/>
-      <w:r>
-        <w:t>If</w:t>
-      </w:r>
-      <w:proofErr w:type="gramEnd"/>
-      <w:r>
-        <w:t xml:space="preserve"> same </w:t>
-      </w:r>
-      <w:proofErr w:type="gramStart"/>
-      <w:r>
-        <w:t>address</w:t>
-      </w:r>
-      <w:proofErr w:type="gramEnd"/>
-      <w:r>
-        <w:t xml:space="preserve"> then </w:t>
-      </w:r>
-      <w:proofErr w:type="gramStart"/>
-      <w:r>
-        <w:t>use</w:t>
-      </w:r>
-      <w:proofErr w:type="gramEnd"/>
-      <w:r>
-        <w:t xml:space="preserve"> newest seq number</w:t>
+      <w:r>
+        <w:t>If same address then use newest seq number</w:t>
       </w:r>
       <w:r>
         <w:t>.</w:t>
@@ -428,15 +440,7 @@
         </w:numPr>
       </w:pPr>
       <w:r>
-        <w:t xml:space="preserve">Allow changes </w:t>
-      </w:r>
-      <w:proofErr w:type="gramStart"/>
-      <w:r>
-        <w:t>on</w:t>
-      </w:r>
-      <w:proofErr w:type="gramEnd"/>
-      <w:r>
-        <w:t xml:space="preserve"> source for new addresses</w:t>
+        <w:t>Allow changes on source for new addresses</w:t>
       </w:r>
     </w:p>
     <w:p>
@@ -460,15 +464,7 @@
         </w:numPr>
       </w:pPr>
       <w:r>
-        <w:t xml:space="preserve">Submit for UAT/Live button.  How does this trigger the process to write to </w:t>
-      </w:r>
-      <w:proofErr w:type="spellStart"/>
-      <w:r>
-        <w:t>Enertia</w:t>
-      </w:r>
-      <w:proofErr w:type="spellEnd"/>
-      <w:r>
-        <w:t xml:space="preserve"> or </w:t>
+        <w:t xml:space="preserve">Submit for UAT/Live button.  How does this trigger the process to write to Enertia or </w:t>
       </w:r>
       <w:r>
         <w:t>t</w:t>
@@ -552,7 +548,6 @@
         <w:pStyle w:val="NoSpacing"/>
       </w:pPr>
       <w:r>
-        <w:lastRenderedPageBreak/>
         <w:t>Street address goes on 1</w:t>
       </w:r>
       <w:r>
@@ -570,15 +565,7 @@
         <w:pStyle w:val="NoSpacing"/>
       </w:pPr>
       <w:r>
-        <w:t xml:space="preserve">Use </w:t>
-      </w:r>
-      <w:proofErr w:type="spellStart"/>
-      <w:r>
-        <w:t>Addr</w:t>
-      </w:r>
-      <w:proofErr w:type="spellEnd"/>
-      <w:r>
-        <w:t xml:space="preserve"> Normal to deconstruct the address.  Then place 1</w:t>
+        <w:t>Use Addr Normal to deconstruct the address.  Then place 1</w:t>
       </w:r>
       <w:r>
         <w:rPr>
@@ -641,7 +628,7 @@
                     <pic:cNvPicPr/>
                   </pic:nvPicPr>
                   <pic:blipFill>
-                    <a:blip r:embed="rId8"/>
+                    <a:blip r:embed="rId10"/>
                     <a:stretch>
                       <a:fillRect/>
                     </a:stretch>
@@ -680,15 +667,7 @@
         <w:pStyle w:val="NoSpacing"/>
       </w:pPr>
       <w:r>
-        <w:t xml:space="preserve">These shouldn’t be 0 match on </w:t>
-      </w:r>
-      <w:proofErr w:type="spellStart"/>
-      <w:r>
-        <w:t>addr</w:t>
-      </w:r>
-      <w:proofErr w:type="spellEnd"/>
-      <w:r>
-        <w:t>:</w:t>
+        <w:t>These shouldn’t be 0 match on addr:</w:t>
       </w:r>
     </w:p>
     <w:p>
@@ -715,7 +694,7 @@
                     <pic:cNvPicPr/>
                   </pic:nvPicPr>
                   <pic:blipFill>
-                    <a:blip r:embed="rId9"/>
+                    <a:blip r:embed="rId11"/>
                     <a:stretch>
                       <a:fillRect/>
                     </a:stretch>
@@ -760,7 +739,7 @@
                     <pic:cNvPicPr/>
                   </pic:nvPicPr>
                   <pic:blipFill>
-                    <a:blip r:embed="rId10"/>
+                    <a:blip r:embed="rId12"/>
                     <a:stretch>
                       <a:fillRect/>
                     </a:stretch>
@@ -805,7 +784,7 @@
                     <pic:cNvPicPr/>
                   </pic:nvPicPr>
                   <pic:blipFill>
-                    <a:blip r:embed="rId11"/>
+                    <a:blip r:embed="rId13"/>
                     <a:stretch>
                       <a:fillRect/>
                     </a:stretch>
@@ -850,7 +829,7 @@
                     <pic:cNvPicPr/>
                   </pic:nvPicPr>
                   <pic:blipFill>
-                    <a:blip r:embed="rId12"/>
+                    <a:blip r:embed="rId14"/>
                     <a:stretch>
                       <a:fillRect/>
                     </a:stretch>
@@ -879,6 +858,7 @@
         <w:rPr>
           <w:noProof/>
         </w:rPr>
+        <w:lastRenderedPageBreak/>
         <w:drawing>
           <wp:inline distT="0" distB="0" distL="0" distR="0" wp14:anchorId="2C6929F3" wp14:editId="0AC46FD4">
             <wp:extent cx="5943600" cy="66675"/>
@@ -895,7 +875,7 @@
                     <pic:cNvPicPr/>
                   </pic:nvPicPr>
                   <pic:blipFill>
-                    <a:blip r:embed="rId13"/>
+                    <a:blip r:embed="rId15"/>
                     <a:stretch>
                       <a:fillRect/>
                     </a:stretch>
@@ -940,7 +920,7 @@
                     <pic:cNvPicPr/>
                   </pic:nvPicPr>
                   <pic:blipFill>
-                    <a:blip r:embed="rId14"/>
+                    <a:blip r:embed="rId16"/>
                     <a:stretch>
                       <a:fillRect/>
                     </a:stretch>
@@ -985,7 +965,7 @@
                     <pic:cNvPicPr/>
                   </pic:nvPicPr>
                   <pic:blipFill>
-                    <a:blip r:embed="rId15"/>
+                    <a:blip r:embed="rId17"/>
                     <a:stretch>
                       <a:fillRect/>
                     </a:stretch>
@@ -1030,7 +1010,7 @@
                     <pic:cNvPicPr/>
                   </pic:nvPicPr>
                   <pic:blipFill>
-                    <a:blip r:embed="rId16"/>
+                    <a:blip r:embed="rId18"/>
                     <a:stretch>
                       <a:fillRect/>
                     </a:stretch>
@@ -1075,7 +1055,7 @@
                     <pic:cNvPicPr/>
                   </pic:nvPicPr>
                   <pic:blipFill>
-                    <a:blip r:embed="rId17"/>
+                    <a:blip r:embed="rId19"/>
                     <a:stretch>
                       <a:fillRect/>
                     </a:stretch>
@@ -1120,7 +1100,7 @@
                     <pic:cNvPicPr/>
                   </pic:nvPicPr>
                   <pic:blipFill>
-                    <a:blip r:embed="rId18"/>
+                    <a:blip r:embed="rId20"/>
                     <a:stretch>
                       <a:fillRect/>
                     </a:stretch>
@@ -1165,7 +1145,7 @@
                     <pic:cNvPicPr/>
                   </pic:nvPicPr>
                   <pic:blipFill>
-                    <a:blip r:embed="rId19"/>
+                    <a:blip r:embed="rId21"/>
                     <a:stretch>
                       <a:fillRect/>
                     </a:stretch>
@@ -1220,7 +1200,7 @@
                     <pic:cNvPicPr/>
                   </pic:nvPicPr>
                   <pic:blipFill>
-                    <a:blip r:embed="rId20"/>
+                    <a:blip r:embed="rId22"/>
                     <a:stretch>
                       <a:fillRect/>
                     </a:stretch>
@@ -1283,7 +1263,7 @@
                     <pic:cNvPicPr/>
                   </pic:nvPicPr>
                   <pic:blipFill>
-                    <a:blip r:embed="rId21"/>
+                    <a:blip r:embed="rId23"/>
                     <a:stretch>
                       <a:fillRect/>
                     </a:stretch>
@@ -1346,7 +1326,7 @@
                     <pic:cNvPicPr/>
                   </pic:nvPicPr>
                   <pic:blipFill>
-                    <a:blip r:embed="rId22"/>
+                    <a:blip r:embed="rId24"/>
                     <a:stretch>
                       <a:fillRect/>
                     </a:stretch>
@@ -1389,13 +1369,8 @@
       <w:pPr>
         <w:pStyle w:val="NoSpacing"/>
       </w:pPr>
-      <w:proofErr w:type="gramStart"/>
-      <w:r>
-        <w:t>At 100</w:t>
-      </w:r>
-      <w:proofErr w:type="gramEnd"/>
-      <w:r>
-        <w:t>% accuracy:</w:t>
+      <w:r>
+        <w:t>At 100% accuracy:</w:t>
       </w:r>
     </w:p>
     <w:p>
@@ -1422,7 +1397,7 @@
                     <pic:cNvPicPr/>
                   </pic:nvPicPr>
                   <pic:blipFill>
-                    <a:blip r:embed="rId23"/>
+                    <a:blip r:embed="rId25"/>
                     <a:stretch>
                       <a:fillRect/>
                     </a:stretch>
@@ -1463,15 +1438,7 @@
         <w:pStyle w:val="NoSpacing"/>
       </w:pPr>
       <w:r>
-        <w:t xml:space="preserve">May need a new bucket or status or column that states all numbers in address match AND city, state, zip match, which I would think would let the user make changes based on this.  </w:t>
-      </w:r>
-      <w:proofErr w:type="gramStart"/>
-      <w:r>
-        <w:t>But</w:t>
-      </w:r>
-      <w:proofErr w:type="gramEnd"/>
-      <w:r>
-        <w:t xml:space="preserve"> need to look at why the 0 match.   </w:t>
+        <w:t xml:space="preserve">May need a new bucket or status or column that states all numbers in address match AND city, state, zip match, which I would think would let the user make changes based on this.  But need to look at why the 0 match.   </w:t>
       </w:r>
     </w:p>
     <w:p>
@@ -1556,15 +1523,8 @@
         <w:pStyle w:val="NoSpacing"/>
       </w:pPr>
       <w:r>
-        <w:t xml:space="preserve">Would adding this is a </w:t>
-      </w:r>
-      <w:proofErr w:type="spellStart"/>
-      <w:r>
-        <w:t>corp</w:t>
-      </w:r>
-      <w:proofErr w:type="spellEnd"/>
-      <w:r>
-        <w:t xml:space="preserve"> help?  </w:t>
+        <w:lastRenderedPageBreak/>
+        <w:t xml:space="preserve">Would adding this is a corp help?  </w:t>
       </w:r>
     </w:p>
     <w:p>
@@ -1625,7 +1585,7 @@
                     <pic:cNvPicPr/>
                   </pic:nvPicPr>
                   <pic:blipFill>
-                    <a:blip r:embed="rId24"/>
+                    <a:blip r:embed="rId26"/>
                     <a:stretch>
                       <a:fillRect/>
                     </a:stretch>
@@ -1661,39 +1621,7 @@
         <w:pStyle w:val="NoSpacing"/>
       </w:pPr>
       <w:r>
-        <w:t xml:space="preserve"> think these need to be broken up.  If </w:t>
-      </w:r>
-      <w:proofErr w:type="spellStart"/>
-      <w:r>
-        <w:t>Addr</w:t>
-      </w:r>
-      <w:proofErr w:type="spellEnd"/>
-      <w:r>
-        <w:t xml:space="preserve"> score is low and name is </w:t>
-      </w:r>
-      <w:proofErr w:type="gramStart"/>
-      <w:r>
-        <w:t>fairly high</w:t>
-      </w:r>
-      <w:proofErr w:type="gramEnd"/>
-      <w:r>
-        <w:t xml:space="preserve"> and </w:t>
-      </w:r>
-      <w:proofErr w:type="spellStart"/>
-      <w:r>
-        <w:t>ssn</w:t>
-      </w:r>
-      <w:proofErr w:type="spellEnd"/>
-      <w:r>
-        <w:t xml:space="preserve"> </w:t>
-      </w:r>
-      <w:proofErr w:type="gramStart"/>
-      <w:r>
-        <w:t>matches</w:t>
-      </w:r>
-      <w:proofErr w:type="gramEnd"/>
-      <w:r>
-        <w:t xml:space="preserve"> then move to existing BA New Address</w:t>
+        <w:t xml:space="preserve"> think these need to be broken up.  If Addr score is low and name is fairly high and ssn matches then move to existing BA New Address</w:t>
       </w:r>
     </w:p>
     <w:p>
@@ -1720,7 +1648,7 @@
                     <pic:cNvPicPr/>
                   </pic:nvPicPr>
                   <pic:blipFill>
-                    <a:blip r:embed="rId25"/>
+                    <a:blip r:embed="rId27"/>
                     <a:stretch>
                       <a:fillRect/>
                     </a:stretch>
@@ -1766,7 +1694,6 @@
         <w:pStyle w:val="NoSpacing"/>
       </w:pPr>
       <w:r>
-        <w:lastRenderedPageBreak/>
         <w:t>**** Need to add the address seq from Canvas.</w:t>
       </w:r>
     </w:p>
@@ -1820,7 +1747,7 @@
                     <pic:cNvPicPr/>
                   </pic:nvPicPr>
                   <pic:blipFill>
-                    <a:blip r:embed="rId26"/>
+                    <a:blip r:embed="rId28"/>
                     <a:stretch>
                       <a:fillRect/>
                     </a:stretch>
@@ -1865,7 +1792,7 @@
                     <pic:cNvPicPr/>
                   </pic:nvPicPr>
                   <pic:blipFill>
-                    <a:blip r:embed="rId27"/>
+                    <a:blip r:embed="rId29"/>
                     <a:stretch>
                       <a:fillRect/>
                     </a:stretch>
@@ -1910,7 +1837,7 @@
                     <pic:cNvPicPr/>
                   </pic:nvPicPr>
                   <pic:blipFill>
-                    <a:blip r:embed="rId28"/>
+                    <a:blip r:embed="rId30"/>
                     <a:stretch>
                       <a:fillRect/>
                     </a:stretch>
@@ -1960,7 +1887,7 @@
                     <pic:cNvPicPr/>
                   </pic:nvPicPr>
                   <pic:blipFill>
-                    <a:blip r:embed="rId29"/>
+                    <a:blip r:embed="rId31"/>
                     <a:stretch>
                       <a:fillRect/>
                     </a:stretch>
@@ -1991,50 +1918,10 @@
         <w:pStyle w:val="NoSpacing"/>
       </w:pPr>
       <w:r>
-        <w:t xml:space="preserve">Why are street address and names, </w:t>
-      </w:r>
-      <w:proofErr w:type="gramStart"/>
-      <w:r>
-        <w:t>zip</w:t>
-      </w:r>
-      <w:proofErr w:type="gramEnd"/>
-      <w:r>
-        <w:t xml:space="preserve"> same but </w:t>
-      </w:r>
-      <w:proofErr w:type="gramStart"/>
-      <w:r>
-        <w:t>city</w:t>
-      </w:r>
-      <w:proofErr w:type="gramEnd"/>
-      <w:r>
-        <w:t xml:space="preserve"> different?  Should I put more emphasis on city names?</w:t>
-      </w:r>
-      <w:r>
-        <w:t xml:space="preserve">  Also, </w:t>
-      </w:r>
-      <w:proofErr w:type="gramStart"/>
-      <w:r>
-        <w:t>should I</w:t>
-      </w:r>
-      <w:proofErr w:type="gramEnd"/>
-      <w:r>
-        <w:t xml:space="preserve"> worry since there are only 137 at max like this.  And if I introduce </w:t>
-      </w:r>
-      <w:proofErr w:type="gramStart"/>
-      <w:r>
-        <w:t>the Smarty</w:t>
-      </w:r>
-      <w:proofErr w:type="gramEnd"/>
-      <w:r>
-        <w:t xml:space="preserve"> streets or Google API </w:t>
-      </w:r>
-      <w:proofErr w:type="gramStart"/>
-      <w:r>
-        <w:t>will that</w:t>
-      </w:r>
-      <w:proofErr w:type="gramEnd"/>
-      <w:r>
-        <w:t xml:space="preserve"> catch any issues like this?</w:t>
+        <w:t>Why are street address and names, zip same but city different?  Should I put more emphasis on city names?</w:t>
+      </w:r>
+      <w:r>
+        <w:t xml:space="preserve">  Also, should I worry since there are only 137 at max like this.  And if I introduce the Smarty streets or Google API will that catch any issues like this?</w:t>
       </w:r>
     </w:p>
     <w:p>
@@ -2061,7 +1948,7 @@
                     <pic:cNvPicPr/>
                   </pic:nvPicPr>
                   <pic:blipFill>
-                    <a:blip r:embed="rId30"/>
+                    <a:blip r:embed="rId32"/>
                     <a:stretch>
                       <a:fillRect/>
                     </a:stretch>
@@ -2097,15 +1984,7 @@
         <w:pStyle w:val="NoSpacing"/>
       </w:pPr>
       <w:r>
-        <w:t xml:space="preserve">Where </w:t>
-      </w:r>
-      <w:proofErr w:type="spellStart"/>
-      <w:r>
-        <w:t>ssn</w:t>
-      </w:r>
-      <w:proofErr w:type="spellEnd"/>
-      <w:r>
-        <w:t xml:space="preserve"> and address matches, but name does not.  </w:t>
+        <w:t xml:space="preserve">Where ssn and address matches, but name does not.  </w:t>
       </w:r>
     </w:p>
     <w:p>
@@ -2116,6 +1995,7 @@
         <w:rPr>
           <w:noProof/>
         </w:rPr>
+        <w:lastRenderedPageBreak/>
         <w:drawing>
           <wp:inline distT="0" distB="0" distL="0" distR="0" wp14:anchorId="215DE4DC" wp14:editId="56B6C566">
             <wp:extent cx="5943600" cy="1077595"/>
@@ -2132,7 +2012,7 @@
                     <pic:cNvPicPr/>
                   </pic:nvPicPr>
                   <pic:blipFill>
-                    <a:blip r:embed="rId31"/>
+                    <a:blip r:embed="rId33"/>
                     <a:stretch>
                       <a:fillRect/>
                     </a:stretch>
@@ -2163,15 +2043,7 @@
         <w:pStyle w:val="NoSpacing"/>
       </w:pPr>
       <w:r>
-        <w:t xml:space="preserve">For J C PACE LTD, the </w:t>
-      </w:r>
-      <w:proofErr w:type="spellStart"/>
-      <w:r>
-        <w:t>Enttaxname</w:t>
-      </w:r>
-      <w:proofErr w:type="spellEnd"/>
-      <w:r>
-        <w:t xml:space="preserve"> matches what we have in Dec Name field.  It’s also attached to address </w:t>
+        <w:t xml:space="preserve">For J C PACE LTD, the Enttaxname matches what we have in Dec Name field.  It’s also attached to address </w:t>
       </w:r>
       <w:r>
         <w:rPr>
@@ -2193,7 +2065,7 @@
                     <pic:cNvPicPr/>
                   </pic:nvPicPr>
                   <pic:blipFill>
-                    <a:blip r:embed="rId32"/>
+                    <a:blip r:embed="rId34"/>
                     <a:stretch>
                       <a:fillRect/>
                     </a:stretch>
@@ -2416,25 +2288,7 @@
         <w:pStyle w:val="NoSpacing"/>
       </w:pPr>
       <w:r>
-        <w:t xml:space="preserve">Can I auto populate BA Types, e.g. jib/rev/vendor, etc. – for </w:t>
-      </w:r>
-      <w:proofErr w:type="spellStart"/>
-      <w:proofErr w:type="gramStart"/>
-      <w:r>
-        <w:t>Enertia</w:t>
-      </w:r>
-      <w:proofErr w:type="spellEnd"/>
-      <w:r>
-        <w:t xml:space="preserve"> to </w:t>
-      </w:r>
-      <w:proofErr w:type="spellStart"/>
-      <w:r>
-        <w:t>Enertia</w:t>
-      </w:r>
-      <w:proofErr w:type="spellEnd"/>
-      <w:proofErr w:type="gramEnd"/>
-      <w:r>
-        <w:t xml:space="preserve"> conversions </w:t>
+        <w:t xml:space="preserve">Can I auto populate BA Types, e.g. jib/rev/vendor, etc. – for Enertia to Enertia conversions </w:t>
       </w:r>
     </w:p>
     <w:tbl>
@@ -3090,7 +2944,6 @@
                 <w:szCs w:val="22"/>
                 <w14:ligatures w14:val="none"/>
               </w:rPr>
-              <w:lastRenderedPageBreak/>
               <w:t>OPER</w:t>
             </w:r>
           </w:p>
@@ -3925,23 +3778,7 @@
         <w:pStyle w:val="NoSpacing"/>
       </w:pPr>
       <w:r>
-        <w:t xml:space="preserve">Done.  Automatically removed and placed in a file in </w:t>
-      </w:r>
-      <w:proofErr w:type="gramStart"/>
-      <w:r>
-        <w:t>the output</w:t>
-      </w:r>
-      <w:proofErr w:type="gramEnd"/>
-      <w:r>
-        <w:t xml:space="preserve"> </w:t>
-      </w:r>
-      <w:proofErr w:type="spellStart"/>
-      <w:r>
-        <w:t>dir</w:t>
-      </w:r>
-      <w:proofErr w:type="spellEnd"/>
-      <w:r>
-        <w:t xml:space="preserve"> 1. Remove exact duplicates from source file</w:t>
+        <w:t>Done.  Automatically removed and placed in a file in the output dir 1. Remove exact duplicates from source file</w:t>
       </w:r>
     </w:p>
     <w:p>
@@ -3976,19 +3813,15 @@
         <w:pStyle w:val="NoSpacing"/>
       </w:pPr>
       <w:r>
-        <w:t xml:space="preserve">5. Easier way to mass </w:t>
-      </w:r>
-      <w:proofErr w:type="gramStart"/>
-      <w:r>
-        <w:t>approve</w:t>
-      </w:r>
-      <w:proofErr w:type="gramEnd"/>
-    </w:p>
-    <w:p>
-      <w:pPr>
-        <w:pStyle w:val="NoSpacing"/>
-      </w:pPr>
-      <w:r>
+        <w:t>5. Easier way to mass approve</w:t>
+      </w:r>
+    </w:p>
+    <w:p>
+      <w:pPr>
+        <w:pStyle w:val="NoSpacing"/>
+      </w:pPr>
+      <w:r>
+        <w:lastRenderedPageBreak/>
         <w:t>6. Allow to run over existing data and choose survival</w:t>
       </w:r>
     </w:p>
@@ -4045,7 +3878,7 @@
                     <pic:cNvPicPr/>
                   </pic:nvPicPr>
                   <pic:blipFill>
-                    <a:blip r:embed="rId33"/>
+                    <a:blip r:embed="rId35"/>
                     <a:stretch>
                       <a:fillRect/>
                     </a:stretch>
@@ -4106,15 +3939,7 @@
         <w:t>MS-SQL, SNO</w:t>
       </w:r>
       <w:r>
-        <w:t xml:space="preserve">WFLAKE, ORACLE, EXCEL, CSV, </w:t>
-      </w:r>
-      <w:proofErr w:type="spellStart"/>
-      <w:r>
-        <w:t>ect</w:t>
-      </w:r>
-      <w:proofErr w:type="spellEnd"/>
-      <w:r>
-        <w:t>.</w:t>
+        <w:t>WFLAKE, ORACLE, EXCEL, CSV, ect.</w:t>
       </w:r>
     </w:p>
     <w:p>
@@ -4138,15 +3963,7 @@
         <w:t>Allow them to choose a table or file for both source and target, then allow them to map</w:t>
       </w:r>
       <w:r>
-        <w:t xml:space="preserve"> fields for comparison like </w:t>
-      </w:r>
-      <w:proofErr w:type="gramStart"/>
-      <w:r>
-        <w:t>in order to</w:t>
-      </w:r>
-      <w:proofErr w:type="gramEnd"/>
-      <w:r>
-        <w:t xml:space="preserve"> merge existing users and addresses, these are usually always filled out so I think we need to stick with these:</w:t>
+        <w:t xml:space="preserve"> fields for comparison like in order to merge existing users and addresses, these are usually always filled out so I think we need to stick with these:</w:t>
       </w:r>
     </w:p>
     <w:p>
@@ -4221,7 +4038,6 @@
         <w:pStyle w:val="NoSpacing"/>
       </w:pPr>
       <w:r>
-        <w:lastRenderedPageBreak/>
         <w:t>Also, allow them to choose other data from either source or target.  Always remove true duplicates from source prior to loading into new system, but everything must match including internal ids</w:t>
       </w:r>
     </w:p>
@@ -4260,49 +4076,15 @@
         <w:pStyle w:val="NoSpacing"/>
       </w:pPr>
       <w:r>
-        <w:t xml:space="preserve">Allow them to choose a system.  If it is </w:t>
-      </w:r>
-      <w:proofErr w:type="spellStart"/>
-      <w:r>
-        <w:t>Enertia</w:t>
-      </w:r>
-      <w:proofErr w:type="spellEnd"/>
-      <w:r>
-        <w:t xml:space="preserve"> to </w:t>
-      </w:r>
-      <w:proofErr w:type="spellStart"/>
-      <w:r>
-        <w:t>Enertia</w:t>
-      </w:r>
-      <w:proofErr w:type="spellEnd"/>
-      <w:r>
-        <w:t xml:space="preserve"> we can auto map many things by default:</w:t>
-      </w:r>
-    </w:p>
-    <w:p>
-      <w:pPr>
-        <w:pStyle w:val="NoSpacing"/>
-      </w:pPr>
-      <w:r>
-        <w:t xml:space="preserve">Can I auto populate BA Types, e.g. jib/rev/vendor, etc. – for </w:t>
-      </w:r>
-      <w:proofErr w:type="spellStart"/>
-      <w:proofErr w:type="gramStart"/>
-      <w:r>
-        <w:t>Enertia</w:t>
-      </w:r>
-      <w:proofErr w:type="spellEnd"/>
-      <w:r>
-        <w:t xml:space="preserve"> to </w:t>
-      </w:r>
-      <w:proofErr w:type="spellStart"/>
-      <w:r>
-        <w:t>Enertia</w:t>
-      </w:r>
-      <w:proofErr w:type="spellEnd"/>
-      <w:proofErr w:type="gramEnd"/>
-      <w:r>
-        <w:t xml:space="preserve"> conversions </w:t>
+        <w:t>Allow them to choose a system.  If it is Enertia to Enertia we can auto map many things by default:</w:t>
+      </w:r>
+    </w:p>
+    <w:p>
+      <w:pPr>
+        <w:pStyle w:val="NoSpacing"/>
+      </w:pPr>
+      <w:r>
+        <w:t xml:space="preserve">Can I auto populate BA Types, e.g. jib/rev/vendor, etc. – for Enertia to Enertia conversions </w:t>
       </w:r>
     </w:p>
     <w:tbl>
@@ -4958,6 +4740,7 @@
                 <w:szCs w:val="22"/>
                 <w14:ligatures w14:val="none"/>
               </w:rPr>
+              <w:lastRenderedPageBreak/>
               <w:t>OPER</w:t>
             </w:r>
           </w:p>
@@ -5825,7 +5608,6 @@
         <w:rPr>
           <w:noProof/>
         </w:rPr>
-        <w:lastRenderedPageBreak/>
         <w:drawing>
           <wp:inline distT="0" distB="0" distL="0" distR="0" wp14:anchorId="152BA910" wp14:editId="2D538599">
             <wp:extent cx="5943600" cy="3039745"/>
@@ -5842,7 +5624,7 @@
                     <pic:cNvPicPr/>
                   </pic:nvPicPr>
                   <pic:blipFill>
-                    <a:blip r:embed="rId34"/>
+                    <a:blip r:embed="rId36"/>
                     <a:stretch>
                       <a:fillRect/>
                     </a:stretch>
@@ -5902,7 +5684,7 @@
                     <pic:cNvPicPr/>
                   </pic:nvPicPr>
                   <pic:blipFill>
-                    <a:blip r:embed="rId35"/>
+                    <a:blip r:embed="rId37"/>
                     <a:stretch>
                       <a:fillRect/>
                     </a:stretch>
@@ -5944,6 +5726,7 @@
         <w:rPr>
           <w:noProof/>
         </w:rPr>
+        <w:lastRenderedPageBreak/>
         <w:drawing>
           <wp:inline distT="0" distB="0" distL="0" distR="0" wp14:anchorId="3C388A13" wp14:editId="50561ECD">
             <wp:extent cx="5943600" cy="149860"/>
@@ -5960,7 +5743,7 @@
                     <pic:cNvPicPr/>
                   </pic:nvPicPr>
                   <pic:blipFill>
-                    <a:blip r:embed="rId36"/>
+                    <a:blip r:embed="rId38"/>
                     <a:stretch>
                       <a:fillRect/>
                     </a:stretch>
@@ -6018,7 +5801,7 @@
                     <pic:cNvPicPr/>
                   </pic:nvPicPr>
                   <pic:blipFill>
-                    <a:blip r:embed="rId37"/>
+                    <a:blip r:embed="rId39"/>
                     <a:stretch>
                       <a:fillRect/>
                     </a:stretch>
@@ -6049,15 +5832,7 @@
         <w:pStyle w:val="NoSpacing"/>
       </w:pPr>
       <w:r>
-        <w:t xml:space="preserve">Don’t auto match into Existing BA by </w:t>
-      </w:r>
-      <w:proofErr w:type="spellStart"/>
-      <w:r>
-        <w:t>ssn</w:t>
-      </w:r>
-      <w:proofErr w:type="spellEnd"/>
-      <w:r>
-        <w:t xml:space="preserve"> alone, score needs to be high.</w:t>
+        <w:t>Don’t auto match into Existing BA by ssn alone, score needs to be high.</w:t>
       </w:r>
     </w:p>
     <w:p>
@@ -6096,29 +5871,8 @@
         <w:pStyle w:val="NoSpacing"/>
       </w:pPr>
       <w:r>
-        <w:t xml:space="preserve">Existing </w:t>
-      </w:r>
-      <w:proofErr w:type="spellStart"/>
-      <w:r>
-        <w:t>ba</w:t>
-      </w:r>
-      <w:proofErr w:type="spellEnd"/>
-      <w:r>
-        <w:t xml:space="preserve"> existing address and existing </w:t>
-      </w:r>
-      <w:proofErr w:type="spellStart"/>
-      <w:r>
-        <w:t>ba</w:t>
-      </w:r>
-      <w:proofErr w:type="spellEnd"/>
-      <w:r>
-        <w:t xml:space="preserve"> new address must </w:t>
-      </w:r>
-      <w:proofErr w:type="gramStart"/>
-      <w:r>
-        <w:t>be  strict</w:t>
-      </w:r>
-      <w:proofErr w:type="gramEnd"/>
+        <w:t>Existing ba existing address and existing ba new address must be  strict</w:t>
+      </w:r>
     </w:p>
     <w:p>
       <w:pPr>
@@ -6144,7 +5898,7 @@
                     <pic:cNvPicPr/>
                   </pic:nvPicPr>
                   <pic:blipFill>
-                    <a:blip r:embed="rId38"/>
+                    <a:blip r:embed="rId40"/>
                     <a:stretch>
                       <a:fillRect/>
                     </a:stretch>
@@ -6264,15 +6018,7 @@
         </w:numPr>
       </w:pPr>
       <w:r>
-        <w:t>Names are normalized first — nicknames resolved (</w:t>
-      </w:r>
-      <w:proofErr w:type="spellStart"/>
-      <w:r>
-        <w:t>Bob→Robert</w:t>
-      </w:r>
-      <w:proofErr w:type="spellEnd"/>
-      <w:r>
-        <w:t>), suffixes standardized (LLC, Corp), special characters stripped</w:t>
+        <w:t>Names are normalized first — nicknames resolved (Bob→Robert), suffixes standardized (LLC, Corp), special characters stripped</w:t>
       </w:r>
     </w:p>
     <w:p>
@@ -6296,15 +6042,7 @@
         </w:numPr>
       </w:pPr>
       <w:r>
-        <w:t xml:space="preserve">Ambiguous name scores (15–50) get sent to Claude Sonnet AI for a second opinion — "Do </w:t>
-      </w:r>
-      <w:proofErr w:type="gramStart"/>
-      <w:r>
-        <w:t>these business</w:t>
-      </w:r>
-      <w:proofErr w:type="gramEnd"/>
-      <w:r>
-        <w:t xml:space="preserve"> names refer to the same entity?" — overrides the score if AI disagrees</w:t>
+        <w:t>Ambiguous name scores (15–50) get sent to Claude Sonnet AI for a second opinion — "Do these business names refer to the same entity?" — overrides the score if AI disagrees</w:t>
       </w:r>
     </w:p>
     <w:p>
@@ -6319,15 +6057,7 @@
         <w:t>Address Scoring (bottom row, left to right)</w:t>
       </w:r>
       <w:r>
-        <w:t xml:space="preserve"> 4. Addresses are normalized — PO Box variants unified, street abbreviations standardized, dates stripped from address fields (data quality issue in source) 5. Address comparison has three paths: PO Box, Street, and Non-Standard (military </w:t>
-      </w:r>
-      <w:proofErr w:type="gramStart"/>
-      <w:r>
-        <w:t>addresses) —</w:t>
-      </w:r>
-      <w:proofErr w:type="gramEnd"/>
-      <w:r>
-        <w:t xml:space="preserve"> each with its own scoring formula combining street similarity and city similarity 6. Ambiguous address scores (15–65) get validated through Google's Address Validation API — both Canvas and DEC addresses are standardized, then re-scored. Persistent cache means zero API calls on re-runs</w:t>
+        <w:t xml:space="preserve"> 4. Addresses are normalized — PO Box variants unified, street abbreviations standardized, dates stripped from address fields (data quality issue in source) 5. Address comparison has three paths: PO Box, Street, and Non-Standard (military addresses) — each with its own scoring formula combining street similarity and city similarity 6. Ambiguous address scores (15–65) get validated through Google's Address Validation API — both Canvas and DEC addresses are standardized, then re-scored. Persistent cache means zero API calls on re-runs</w:t>
       </w:r>
     </w:p>
     <w:p>
@@ -6339,6 +6069,7 @@
           <w:b/>
           <w:bCs/>
         </w:rPr>
+        <w:lastRenderedPageBreak/>
         <w:t>Classification (right side)</w:t>
       </w:r>
       <w:r>
@@ -6393,15 +6124,7 @@
         </w:numPr>
       </w:pPr>
       <w:r>
-        <w:t xml:space="preserve">Persistent </w:t>
-      </w:r>
-      <w:proofErr w:type="gramStart"/>
-      <w:r>
-        <w:t>caching</w:t>
-      </w:r>
-      <w:proofErr w:type="gramEnd"/>
-      <w:r>
-        <w:t xml:space="preserve"> = cost-controlled (no redundant API calls)</w:t>
+        <w:t>Persistent caching = cost-controlled (no redundant API calls)</w:t>
       </w:r>
     </w:p>
     <w:p>
@@ -6459,23 +6182,7 @@
           <w:b/>
           <w:bCs/>
         </w:rPr>
-        <w:t xml:space="preserve">Client Presentation - BA/Address Import (Canvas - </w:t>
-      </w:r>
-      <w:proofErr w:type="spellStart"/>
-      <w:r>
-        <w:rPr>
-          <w:b/>
-          <w:bCs/>
-        </w:rPr>
-        <w:t>Enertia</w:t>
-      </w:r>
-      <w:proofErr w:type="spellEnd"/>
-      <w:r>
-        <w:rPr>
-          <w:b/>
-          <w:bCs/>
-        </w:rPr>
-        <w:t>)</w:t>
+        <w:t>Client Presentation - BA/Address Import (Canvas - Enertia)</w:t>
       </w:r>
     </w:p>
     <w:p>
@@ -6503,16 +6210,7 @@
         </w:numPr>
       </w:pPr>
       <w:r>
-        <w:lastRenderedPageBreak/>
-        <w:t xml:space="preserve">"This tool reviews and processes BA/address matches between Canvas and </w:t>
-      </w:r>
-      <w:proofErr w:type="spellStart"/>
-      <w:r>
-        <w:t>Enertia</w:t>
-      </w:r>
-      <w:proofErr w:type="spellEnd"/>
-      <w:r>
-        <w:t xml:space="preserve"> (DEC) systems"</w:t>
+        <w:t>"This tool reviews and processes BA/address matches between Canvas and Enertia (DEC) systems"</w:t>
       </w:r>
     </w:p>
     <w:p>
@@ -6708,23 +6406,7 @@
         </w:numPr>
       </w:pPr>
       <w:r>
-        <w:t>"Orange-highlighted rows flag records containing '</w:t>
-      </w:r>
-      <w:proofErr w:type="gramStart"/>
-      <w:r>
-        <w:t>trust' —</w:t>
-      </w:r>
-      <w:proofErr w:type="gramEnd"/>
-      <w:r>
-        <w:t xml:space="preserve"> </w:t>
-      </w:r>
-      <w:proofErr w:type="gramStart"/>
-      <w:r>
-        <w:t>draws</w:t>
-      </w:r>
-      <w:proofErr w:type="gramEnd"/>
-      <w:r>
-        <w:t xml:space="preserve"> attention for manual review"</w:t>
+        <w:t>"Orange-highlighted rows flag records containing 'trust' — draws attention for manual review"</w:t>
       </w:r>
     </w:p>
     <w:p>
@@ -6776,6 +6458,7 @@
         </w:numPr>
       </w:pPr>
       <w:r>
+        <w:lastRenderedPageBreak/>
         <w:t>"Right-click the Process header to bulk-set all visible rows at once — saves time on large batches"</w:t>
       </w:r>
     </w:p>
@@ -6816,15 +6499,7 @@
         </w:numPr>
       </w:pPr>
       <w:r>
-        <w:t xml:space="preserve">"Or use the edit </w:t>
-      </w:r>
-      <w:proofErr w:type="gramStart"/>
-      <w:r>
-        <w:t>modal</w:t>
-      </w:r>
-      <w:proofErr w:type="gramEnd"/>
-      <w:r>
-        <w:t xml:space="preserve"> for detailed side-by-side Canvas vs DEC comparison"</w:t>
+        <w:t>"Or use the edit modal for detailed side-by-side Canvas vs DEC comparison"</w:t>
       </w:r>
     </w:p>
     <w:p>

</xml_diff>

<commit_message>
Updating to Staging all columns
Co-Authored-By: Claude Sonnet 4.6 <noreply@anthropic.com>
</commit_message>
<xml_diff>
--- a/Things to consider.docx
+++ b/Things to consider.docx
@@ -4,9 +4,328 @@
   <w:body>
     <w:p>
       <w:pPr>
+        <w:rPr>
+          <w:b/>
+          <w:bCs/>
+        </w:rPr>
+      </w:pPr>
+      <w:r>
+        <w:rPr>
+          <w:b/>
+          <w:bCs/>
+        </w:rPr>
+        <w:t>Smarty Street</w:t>
+      </w:r>
+    </w:p>
+    <w:p>
+      <w:pPr>
+        <w:pStyle w:val="ListParagraph"/>
+        <w:numPr>
+          <w:ilvl w:val="0"/>
+          <w:numId w:val="17"/>
+        </w:numPr>
+      </w:pPr>
+      <w:r>
+        <w:t>Name in address captured</w:t>
+      </w:r>
+      <w:r>
+        <w:t>. – Need to keep name</w:t>
+      </w:r>
+    </w:p>
+    <w:p>
+      <w:pPr>
+        <w:pStyle w:val="ListParagraph"/>
+        <w:numPr>
+          <w:ilvl w:val="0"/>
+          <w:numId w:val="17"/>
+        </w:numPr>
+      </w:pPr>
+      <w:proofErr w:type="gramStart"/>
+      <w:r>
+        <w:t>Better</w:t>
+      </w:r>
+      <w:proofErr w:type="gramEnd"/>
+      <w:r>
+        <w:t xml:space="preserve"> to use single line of address</w:t>
+      </w:r>
+      <w:r>
+        <w:t xml:space="preserve">. – Whatever works best </w:t>
+      </w:r>
+    </w:p>
+    <w:p>
+      <w:pPr>
+        <w:pStyle w:val="ListParagraph"/>
+        <w:numPr>
+          <w:ilvl w:val="0"/>
+          <w:numId w:val="17"/>
+        </w:numPr>
+      </w:pPr>
+      <w:r>
+        <w:t>Are we charged for multiple calls for same address.  Do they have a pattern to help reduce calls.</w:t>
+      </w:r>
+      <w:r>
+        <w:t xml:space="preserve"> </w:t>
+      </w:r>
+    </w:p>
+    <w:p>
+      <w:pPr>
+        <w:pStyle w:val="ListParagraph"/>
+        <w:numPr>
+          <w:ilvl w:val="0"/>
+          <w:numId w:val="17"/>
+        </w:numPr>
+      </w:pPr>
+      <w:r>
+        <w:t xml:space="preserve">Will they automatically detect </w:t>
+      </w:r>
+      <w:proofErr w:type="gramStart"/>
+      <w:r>
+        <w:t>non US</w:t>
+      </w:r>
+      <w:proofErr w:type="gramEnd"/>
+      <w:r>
+        <w:t xml:space="preserve"> addresses or do I need another call</w:t>
+      </w:r>
+      <w:r>
+        <w:t xml:space="preserve">.  Separate APIs.  </w:t>
+      </w:r>
+    </w:p>
+    <w:p>
+      <w:pPr>
+        <w:pStyle w:val="ListParagraph"/>
+        <w:numPr>
+          <w:ilvl w:val="0"/>
+          <w:numId w:val="17"/>
+        </w:numPr>
+      </w:pPr>
+      <w:r>
+        <w:t xml:space="preserve">We will </w:t>
+      </w:r>
+      <w:proofErr w:type="gramStart"/>
+      <w:r>
+        <w:t>use on</w:t>
+      </w:r>
+      <w:proofErr w:type="gramEnd"/>
+      <w:r>
+        <w:t xml:space="preserve"> a </w:t>
+      </w:r>
+      <w:proofErr w:type="gramStart"/>
+      <w:r>
+        <w:t xml:space="preserve">project </w:t>
+      </w:r>
+      <w:r>
+        <w:t>by project</w:t>
+      </w:r>
+      <w:proofErr w:type="gramEnd"/>
+      <w:r>
+        <w:t xml:space="preserve"> system with batches of data 5K to 400K in size possibly larger.  Yearly plan.  2M /year </w:t>
+      </w:r>
+      <w:r>
+        <w:t>–</w:t>
+      </w:r>
+      <w:r>
+        <w:t xml:space="preserve"> </w:t>
+      </w:r>
+    </w:p>
+    <w:p/>
+    <w:p/>
+    <w:p>
+      <w:pPr>
+        <w:pStyle w:val="ListParagraph"/>
+        <w:numPr>
+          <w:ilvl w:val="0"/>
+          <w:numId w:val="18"/>
+        </w:numPr>
+      </w:pPr>
+      <w:r>
+        <w:t xml:space="preserve">Save address as is </w:t>
+      </w:r>
+      <w:proofErr w:type="gramStart"/>
+      <w:r>
+        <w:t>in</w:t>
+      </w:r>
+      <w:proofErr w:type="gramEnd"/>
+      <w:r>
+        <w:t xml:space="preserve"> a table </w:t>
+      </w:r>
+    </w:p>
+    <w:p>
+      <w:pPr>
+        <w:pStyle w:val="ListParagraph"/>
+        <w:numPr>
+          <w:ilvl w:val="0"/>
+          <w:numId w:val="18"/>
+        </w:numPr>
+      </w:pPr>
+      <w:r>
+        <w:t xml:space="preserve">Save normalized address without </w:t>
+      </w:r>
+    </w:p>
+    <w:p/>
+    <w:p>
+      <w:pPr>
+        <w:pStyle w:val="NoSpacing"/>
+      </w:pPr>
+    </w:p>
+    <w:p>
+      <w:pPr>
+        <w:pStyle w:val="NoSpacing"/>
+      </w:pPr>
+      <w:r>
+        <w:t xml:space="preserve">Tue_May_31: Mike/Cristian </w:t>
+      </w:r>
+      <w:proofErr w:type="gramStart"/>
+      <w:r>
+        <w:t>complete</w:t>
+      </w:r>
+      <w:proofErr w:type="gramEnd"/>
+      <w:r>
+        <w:t xml:space="preserve"> deployment of PROD for Steve</w:t>
+      </w:r>
+    </w:p>
+    <w:p>
+      <w:pPr>
+        <w:pStyle w:val="NoSpacing"/>
+      </w:pPr>
+      <w:r>
+        <w:t xml:space="preserve">Tue_May_31: Cristian assists Mike with instructions to </w:t>
+      </w:r>
+      <w:proofErr w:type="gramStart"/>
+      <w:r>
+        <w:t>setup</w:t>
+      </w:r>
+      <w:proofErr w:type="gramEnd"/>
+      <w:r>
+        <w:t xml:space="preserve"> the new version of the VPN</w:t>
+      </w:r>
+    </w:p>
+    <w:p>
+      <w:pPr>
+        <w:pStyle w:val="NoSpacing"/>
+      </w:pPr>
+      <w:r>
+        <w:t xml:space="preserve">Thu_Apr_02: Steve has </w:t>
+      </w:r>
+      <w:r>
+        <w:rPr>
+          <w:b/>
+          <w:bCs/>
+        </w:rPr>
+        <w:t xml:space="preserve">confirmed </w:t>
+      </w:r>
+      <w:r>
+        <w:t>access to PROD environment </w:t>
+      </w:r>
+    </w:p>
+    <w:p>
+      <w:pPr>
+        <w:pStyle w:val="NoSpacing"/>
+      </w:pPr>
+      <w:r>
+        <w:t xml:space="preserve">Wed_Apr_01-Mon_Apr_06: Cristian to </w:t>
+      </w:r>
+      <w:proofErr w:type="gramStart"/>
+      <w:r>
+        <w:t>setup</w:t>
+      </w:r>
+      <w:proofErr w:type="gramEnd"/>
+      <w:r>
+        <w:t xml:space="preserve"> CI/CD for Staging Environment</w:t>
+      </w:r>
+    </w:p>
+    <w:p>
+      <w:pPr>
+        <w:pStyle w:val="NoSpacing"/>
+      </w:pPr>
+      <w:r>
+        <w:t>Wed_Apr_01-Tue_Apr_07: Mike/Julio to continue working on improvements (Authentications and Functionals)</w:t>
+      </w:r>
+    </w:p>
+    <w:p>
+      <w:pPr>
+        <w:pStyle w:val="NoSpacing"/>
+      </w:pPr>
+      <w:r>
+        <w:t>Tue_Apr_07:  </w:t>
+      </w:r>
+      <w:proofErr w:type="spellStart"/>
+      <w:r>
+        <w:t>EoD</w:t>
+      </w:r>
+      <w:proofErr w:type="spellEnd"/>
+      <w:r>
+        <w:t>: New Deployment to STAGING APP Server</w:t>
+      </w:r>
+    </w:p>
+    <w:p>
+      <w:pPr>
+        <w:pStyle w:val="NoSpacing"/>
+      </w:pPr>
+      <w:r>
+        <w:t>Thu_Apr_09: New Deployment to PROD APP Server</w:t>
+      </w:r>
+    </w:p>
+    <w:p>
+      <w:pPr>
+        <w:pStyle w:val="NoSpacing"/>
+      </w:pPr>
+      <w:r>
+        <w:t> </w:t>
+      </w:r>
+    </w:p>
+    <w:p>
+      <w:pPr>
+        <w:pStyle w:val="NoSpacing"/>
+      </w:pPr>
+      <w:r>
+        <w:t>Backlog: </w:t>
+      </w:r>
+    </w:p>
+    <w:p>
+      <w:pPr>
+        <w:pStyle w:val="NoSpacing"/>
+      </w:pPr>
+      <w:r>
+        <w:t> </w:t>
+      </w:r>
+    </w:p>
+    <w:p>
+      <w:pPr>
+        <w:pStyle w:val="NoSpacing"/>
+      </w:pPr>
+      <w:r>
+        <w:t>Incorporate DATA STAGING process for BAs in the workflow</w:t>
+      </w:r>
+    </w:p>
+    <w:p>
+      <w:pPr>
+        <w:pStyle w:val="NoSpacing"/>
+      </w:pPr>
+      <w:r>
+        <w:t>Implementing a DATA-DEV schema to DATA-PROD schema structure and transition as part of the CI/CD workflow</w:t>
+      </w:r>
+    </w:p>
+    <w:p>
+      <w:pPr>
+        <w:pStyle w:val="NoSpacing"/>
+      </w:pPr>
+      <w:r>
+        <w:t> </w:t>
+      </w:r>
+    </w:p>
+    <w:p>
+      <w:pPr>
         <w:ind w:left="720" w:hanging="360"/>
       </w:pPr>
-      <w:r>
+    </w:p>
+    <w:p>
+      <w:pPr>
+        <w:ind w:left="720" w:hanging="360"/>
+      </w:pPr>
+      <w:r>
+        <w:rPr>
+          <w:noProof/>
+        </w:rPr>
         <w:drawing>
           <wp:inline distT="0" distB="0" distL="0" distR="0" wp14:anchorId="00E766D1" wp14:editId="411D0038">
             <wp:extent cx="5943600" cy="184785"/>
@@ -56,7 +375,9 @@
         <w:rPr>
           <w:b/>
           <w:bCs/>
+          <w:noProof/>
         </w:rPr>
+        <w:lastRenderedPageBreak/>
         <w:drawing>
           <wp:inline distT="0" distB="0" distL="0" distR="0" wp14:anchorId="14F90506" wp14:editId="7DE45354">
             <wp:extent cx="5943600" cy="2861945"/>
@@ -7297,6 +7618,333 @@
     </w:lvl>
   </w:abstractNum>
   <w:abstractNum w:abstractNumId="5" w15:restartNumberingAfterBreak="0">
+    <w:nsid w:val="203B3FF3"/>
+    <w:multiLevelType w:val="hybridMultilevel"/>
+    <w:tmpl w:val="76D8D332"/>
+    <w:lvl w:ilvl="0" w:tplc="0409000F">
+      <w:start w:val="1"/>
+      <w:numFmt w:val="decimal"/>
+      <w:lvlText w:val="%1."/>
+      <w:lvlJc w:val="left"/>
+      <w:pPr>
+        <w:ind w:left="720" w:hanging="360"/>
+      </w:pPr>
+      <w:rPr>
+        <w:rFonts w:hint="default"/>
+      </w:rPr>
+    </w:lvl>
+    <w:lvl w:ilvl="1" w:tplc="04090019" w:tentative="1">
+      <w:start w:val="1"/>
+      <w:numFmt w:val="lowerLetter"/>
+      <w:lvlText w:val="%2."/>
+      <w:lvlJc w:val="left"/>
+      <w:pPr>
+        <w:ind w:left="1440" w:hanging="360"/>
+      </w:pPr>
+    </w:lvl>
+    <w:lvl w:ilvl="2" w:tplc="0409001B" w:tentative="1">
+      <w:start w:val="1"/>
+      <w:numFmt w:val="lowerRoman"/>
+      <w:lvlText w:val="%3."/>
+      <w:lvlJc w:val="right"/>
+      <w:pPr>
+        <w:ind w:left="2160" w:hanging="180"/>
+      </w:pPr>
+    </w:lvl>
+    <w:lvl w:ilvl="3" w:tplc="0409000F" w:tentative="1">
+      <w:start w:val="1"/>
+      <w:numFmt w:val="decimal"/>
+      <w:lvlText w:val="%4."/>
+      <w:lvlJc w:val="left"/>
+      <w:pPr>
+        <w:ind w:left="2880" w:hanging="360"/>
+      </w:pPr>
+    </w:lvl>
+    <w:lvl w:ilvl="4" w:tplc="04090019" w:tentative="1">
+      <w:start w:val="1"/>
+      <w:numFmt w:val="lowerLetter"/>
+      <w:lvlText w:val="%5."/>
+      <w:lvlJc w:val="left"/>
+      <w:pPr>
+        <w:ind w:left="3600" w:hanging="360"/>
+      </w:pPr>
+    </w:lvl>
+    <w:lvl w:ilvl="5" w:tplc="0409001B" w:tentative="1">
+      <w:start w:val="1"/>
+      <w:numFmt w:val="lowerRoman"/>
+      <w:lvlText w:val="%6."/>
+      <w:lvlJc w:val="right"/>
+      <w:pPr>
+        <w:ind w:left="4320" w:hanging="180"/>
+      </w:pPr>
+    </w:lvl>
+    <w:lvl w:ilvl="6" w:tplc="0409000F" w:tentative="1">
+      <w:start w:val="1"/>
+      <w:numFmt w:val="decimal"/>
+      <w:lvlText w:val="%7."/>
+      <w:lvlJc w:val="left"/>
+      <w:pPr>
+        <w:ind w:left="5040" w:hanging="360"/>
+      </w:pPr>
+    </w:lvl>
+    <w:lvl w:ilvl="7" w:tplc="04090019" w:tentative="1">
+      <w:start w:val="1"/>
+      <w:numFmt w:val="lowerLetter"/>
+      <w:lvlText w:val="%8."/>
+      <w:lvlJc w:val="left"/>
+      <w:pPr>
+        <w:ind w:left="5760" w:hanging="360"/>
+      </w:pPr>
+    </w:lvl>
+    <w:lvl w:ilvl="8" w:tplc="0409001B" w:tentative="1">
+      <w:start w:val="1"/>
+      <w:numFmt w:val="lowerRoman"/>
+      <w:lvlText w:val="%9."/>
+      <w:lvlJc w:val="right"/>
+      <w:pPr>
+        <w:ind w:left="6480" w:hanging="180"/>
+      </w:pPr>
+    </w:lvl>
+  </w:abstractNum>
+  <w:abstractNum w:abstractNumId="6" w15:restartNumberingAfterBreak="0">
+    <w:nsid w:val="2C795FF7"/>
+    <w:multiLevelType w:val="multilevel"/>
+    <w:tmpl w:val="A5588BC4"/>
+    <w:lvl w:ilvl="0">
+      <w:start w:val="1"/>
+      <w:numFmt w:val="bullet"/>
+      <w:lvlText w:val=""/>
+      <w:lvlJc w:val="left"/>
+      <w:pPr>
+        <w:tabs>
+          <w:tab w:val="num" w:pos="720"/>
+        </w:tabs>
+        <w:ind w:left="720" w:hanging="360"/>
+      </w:pPr>
+      <w:rPr>
+        <w:rFonts w:ascii="Symbol" w:hAnsi="Symbol" w:hint="default"/>
+        <w:sz w:val="20"/>
+      </w:rPr>
+    </w:lvl>
+    <w:lvl w:ilvl="1" w:tentative="1">
+      <w:start w:val="1"/>
+      <w:numFmt w:val="bullet"/>
+      <w:lvlText w:val="o"/>
+      <w:lvlJc w:val="left"/>
+      <w:pPr>
+        <w:tabs>
+          <w:tab w:val="num" w:pos="1440"/>
+        </w:tabs>
+        <w:ind w:left="1440" w:hanging="360"/>
+      </w:pPr>
+      <w:rPr>
+        <w:rFonts w:ascii="Courier New" w:hAnsi="Courier New" w:hint="default"/>
+        <w:sz w:val="20"/>
+      </w:rPr>
+    </w:lvl>
+    <w:lvl w:ilvl="2" w:tentative="1">
+      <w:start w:val="1"/>
+      <w:numFmt w:val="bullet"/>
+      <w:lvlText w:val=""/>
+      <w:lvlJc w:val="left"/>
+      <w:pPr>
+        <w:tabs>
+          <w:tab w:val="num" w:pos="2160"/>
+        </w:tabs>
+        <w:ind w:left="2160" w:hanging="360"/>
+      </w:pPr>
+      <w:rPr>
+        <w:rFonts w:ascii="Wingdings" w:hAnsi="Wingdings" w:hint="default"/>
+        <w:sz w:val="20"/>
+      </w:rPr>
+    </w:lvl>
+    <w:lvl w:ilvl="3" w:tentative="1">
+      <w:start w:val="1"/>
+      <w:numFmt w:val="bullet"/>
+      <w:lvlText w:val=""/>
+      <w:lvlJc w:val="left"/>
+      <w:pPr>
+        <w:tabs>
+          <w:tab w:val="num" w:pos="2880"/>
+        </w:tabs>
+        <w:ind w:left="2880" w:hanging="360"/>
+      </w:pPr>
+      <w:rPr>
+        <w:rFonts w:ascii="Wingdings" w:hAnsi="Wingdings" w:hint="default"/>
+        <w:sz w:val="20"/>
+      </w:rPr>
+    </w:lvl>
+    <w:lvl w:ilvl="4" w:tentative="1">
+      <w:start w:val="1"/>
+      <w:numFmt w:val="bullet"/>
+      <w:lvlText w:val=""/>
+      <w:lvlJc w:val="left"/>
+      <w:pPr>
+        <w:tabs>
+          <w:tab w:val="num" w:pos="3600"/>
+        </w:tabs>
+        <w:ind w:left="3600" w:hanging="360"/>
+      </w:pPr>
+      <w:rPr>
+        <w:rFonts w:ascii="Wingdings" w:hAnsi="Wingdings" w:hint="default"/>
+        <w:sz w:val="20"/>
+      </w:rPr>
+    </w:lvl>
+    <w:lvl w:ilvl="5" w:tentative="1">
+      <w:start w:val="1"/>
+      <w:numFmt w:val="bullet"/>
+      <w:lvlText w:val=""/>
+      <w:lvlJc w:val="left"/>
+      <w:pPr>
+        <w:tabs>
+          <w:tab w:val="num" w:pos="4320"/>
+        </w:tabs>
+        <w:ind w:left="4320" w:hanging="360"/>
+      </w:pPr>
+      <w:rPr>
+        <w:rFonts w:ascii="Wingdings" w:hAnsi="Wingdings" w:hint="default"/>
+        <w:sz w:val="20"/>
+      </w:rPr>
+    </w:lvl>
+    <w:lvl w:ilvl="6" w:tentative="1">
+      <w:start w:val="1"/>
+      <w:numFmt w:val="bullet"/>
+      <w:lvlText w:val=""/>
+      <w:lvlJc w:val="left"/>
+      <w:pPr>
+        <w:tabs>
+          <w:tab w:val="num" w:pos="5040"/>
+        </w:tabs>
+        <w:ind w:left="5040" w:hanging="360"/>
+      </w:pPr>
+      <w:rPr>
+        <w:rFonts w:ascii="Wingdings" w:hAnsi="Wingdings" w:hint="default"/>
+        <w:sz w:val="20"/>
+      </w:rPr>
+    </w:lvl>
+    <w:lvl w:ilvl="7" w:tentative="1">
+      <w:start w:val="1"/>
+      <w:numFmt w:val="bullet"/>
+      <w:lvlText w:val=""/>
+      <w:lvlJc w:val="left"/>
+      <w:pPr>
+        <w:tabs>
+          <w:tab w:val="num" w:pos="5760"/>
+        </w:tabs>
+        <w:ind w:left="5760" w:hanging="360"/>
+      </w:pPr>
+      <w:rPr>
+        <w:rFonts w:ascii="Wingdings" w:hAnsi="Wingdings" w:hint="default"/>
+        <w:sz w:val="20"/>
+      </w:rPr>
+    </w:lvl>
+    <w:lvl w:ilvl="8" w:tentative="1">
+      <w:start w:val="1"/>
+      <w:numFmt w:val="bullet"/>
+      <w:lvlText w:val=""/>
+      <w:lvlJc w:val="left"/>
+      <w:pPr>
+        <w:tabs>
+          <w:tab w:val="num" w:pos="6480"/>
+        </w:tabs>
+        <w:ind w:left="6480" w:hanging="360"/>
+      </w:pPr>
+      <w:rPr>
+        <w:rFonts w:ascii="Wingdings" w:hAnsi="Wingdings" w:hint="default"/>
+        <w:sz w:val="20"/>
+      </w:rPr>
+    </w:lvl>
+  </w:abstractNum>
+  <w:abstractNum w:abstractNumId="7" w15:restartNumberingAfterBreak="0">
+    <w:nsid w:val="2E0A7AAD"/>
+    <w:multiLevelType w:val="hybridMultilevel"/>
+    <w:tmpl w:val="BE205F78"/>
+    <w:lvl w:ilvl="0" w:tplc="0409000F">
+      <w:start w:val="1"/>
+      <w:numFmt w:val="decimal"/>
+      <w:lvlText w:val="%1."/>
+      <w:lvlJc w:val="left"/>
+      <w:pPr>
+        <w:ind w:left="720" w:hanging="360"/>
+      </w:pPr>
+      <w:rPr>
+        <w:rFonts w:hint="default"/>
+      </w:rPr>
+    </w:lvl>
+    <w:lvl w:ilvl="1" w:tplc="04090019" w:tentative="1">
+      <w:start w:val="1"/>
+      <w:numFmt w:val="lowerLetter"/>
+      <w:lvlText w:val="%2."/>
+      <w:lvlJc w:val="left"/>
+      <w:pPr>
+        <w:ind w:left="1440" w:hanging="360"/>
+      </w:pPr>
+    </w:lvl>
+    <w:lvl w:ilvl="2" w:tplc="0409001B" w:tentative="1">
+      <w:start w:val="1"/>
+      <w:numFmt w:val="lowerRoman"/>
+      <w:lvlText w:val="%3."/>
+      <w:lvlJc w:val="right"/>
+      <w:pPr>
+        <w:ind w:left="2160" w:hanging="180"/>
+      </w:pPr>
+    </w:lvl>
+    <w:lvl w:ilvl="3" w:tplc="0409000F" w:tentative="1">
+      <w:start w:val="1"/>
+      <w:numFmt w:val="decimal"/>
+      <w:lvlText w:val="%4."/>
+      <w:lvlJc w:val="left"/>
+      <w:pPr>
+        <w:ind w:left="2880" w:hanging="360"/>
+      </w:pPr>
+    </w:lvl>
+    <w:lvl w:ilvl="4" w:tplc="04090019" w:tentative="1">
+      <w:start w:val="1"/>
+      <w:numFmt w:val="lowerLetter"/>
+      <w:lvlText w:val="%5."/>
+      <w:lvlJc w:val="left"/>
+      <w:pPr>
+        <w:ind w:left="3600" w:hanging="360"/>
+      </w:pPr>
+    </w:lvl>
+    <w:lvl w:ilvl="5" w:tplc="0409001B" w:tentative="1">
+      <w:start w:val="1"/>
+      <w:numFmt w:val="lowerRoman"/>
+      <w:lvlText w:val="%6."/>
+      <w:lvlJc w:val="right"/>
+      <w:pPr>
+        <w:ind w:left="4320" w:hanging="180"/>
+      </w:pPr>
+    </w:lvl>
+    <w:lvl w:ilvl="6" w:tplc="0409000F" w:tentative="1">
+      <w:start w:val="1"/>
+      <w:numFmt w:val="decimal"/>
+      <w:lvlText w:val="%7."/>
+      <w:lvlJc w:val="left"/>
+      <w:pPr>
+        <w:ind w:left="5040" w:hanging="360"/>
+      </w:pPr>
+    </w:lvl>
+    <w:lvl w:ilvl="7" w:tplc="04090019" w:tentative="1">
+      <w:start w:val="1"/>
+      <w:numFmt w:val="lowerLetter"/>
+      <w:lvlText w:val="%8."/>
+      <w:lvlJc w:val="left"/>
+      <w:pPr>
+        <w:ind w:left="5760" w:hanging="360"/>
+      </w:pPr>
+    </w:lvl>
+    <w:lvl w:ilvl="8" w:tplc="0409001B" w:tentative="1">
+      <w:start w:val="1"/>
+      <w:numFmt w:val="lowerRoman"/>
+      <w:lvlText w:val="%9."/>
+      <w:lvlJc w:val="right"/>
+      <w:pPr>
+        <w:ind w:left="6480" w:hanging="180"/>
+      </w:pPr>
+    </w:lvl>
+  </w:abstractNum>
+  <w:abstractNum w:abstractNumId="8" w15:restartNumberingAfterBreak="0">
     <w:nsid w:val="37B00B2E"/>
     <w:multiLevelType w:val="multilevel"/>
     <w:tmpl w:val="4EE04E0C"/>
@@ -7445,7 +8093,7 @@
       </w:rPr>
     </w:lvl>
   </w:abstractNum>
-  <w:abstractNum w:abstractNumId="6" w15:restartNumberingAfterBreak="0">
+  <w:abstractNum w:abstractNumId="9" w15:restartNumberingAfterBreak="0">
     <w:nsid w:val="39BD4972"/>
     <w:multiLevelType w:val="multilevel"/>
     <w:tmpl w:val="E2124C86"/>
@@ -7594,7 +8242,7 @@
       </w:rPr>
     </w:lvl>
   </w:abstractNum>
-  <w:abstractNum w:abstractNumId="7" w15:restartNumberingAfterBreak="0">
+  <w:abstractNum w:abstractNumId="10" w15:restartNumberingAfterBreak="0">
     <w:nsid w:val="3B0E4841"/>
     <w:multiLevelType w:val="multilevel"/>
     <w:tmpl w:val="3306D9EE"/>
@@ -7743,7 +8391,7 @@
       </w:rPr>
     </w:lvl>
   </w:abstractNum>
-  <w:abstractNum w:abstractNumId="8" w15:restartNumberingAfterBreak="0">
+  <w:abstractNum w:abstractNumId="11" w15:restartNumberingAfterBreak="0">
     <w:nsid w:val="4CF05109"/>
     <w:multiLevelType w:val="multilevel"/>
     <w:tmpl w:val="F840614A"/>
@@ -7892,7 +8540,7 @@
       </w:rPr>
     </w:lvl>
   </w:abstractNum>
-  <w:abstractNum w:abstractNumId="9" w15:restartNumberingAfterBreak="0">
+  <w:abstractNum w:abstractNumId="12" w15:restartNumberingAfterBreak="0">
     <w:nsid w:val="56FE0E20"/>
     <w:multiLevelType w:val="hybridMultilevel"/>
     <w:tmpl w:val="6EC04ECA"/>
@@ -8005,7 +8653,7 @@
       </w:rPr>
     </w:lvl>
   </w:abstractNum>
-  <w:abstractNum w:abstractNumId="10" w15:restartNumberingAfterBreak="0">
+  <w:abstractNum w:abstractNumId="13" w15:restartNumberingAfterBreak="0">
     <w:nsid w:val="68512BA7"/>
     <w:multiLevelType w:val="multilevel"/>
     <w:tmpl w:val="A9CA261E"/>
@@ -8154,7 +8802,7 @@
       </w:rPr>
     </w:lvl>
   </w:abstractNum>
-  <w:abstractNum w:abstractNumId="11" w15:restartNumberingAfterBreak="0">
+  <w:abstractNum w:abstractNumId="14" w15:restartNumberingAfterBreak="0">
     <w:nsid w:val="6C7E7EBC"/>
     <w:multiLevelType w:val="multilevel"/>
     <w:tmpl w:val="94306474"/>
@@ -8303,7 +8951,156 @@
       </w:rPr>
     </w:lvl>
   </w:abstractNum>
-  <w:abstractNum w:abstractNumId="12" w15:restartNumberingAfterBreak="0">
+  <w:abstractNum w:abstractNumId="15" w15:restartNumberingAfterBreak="0">
+    <w:nsid w:val="74A06BA4"/>
+    <w:multiLevelType w:val="multilevel"/>
+    <w:tmpl w:val="956E44B2"/>
+    <w:lvl w:ilvl="0">
+      <w:start w:val="1"/>
+      <w:numFmt w:val="bullet"/>
+      <w:lvlText w:val=""/>
+      <w:lvlJc w:val="left"/>
+      <w:pPr>
+        <w:tabs>
+          <w:tab w:val="num" w:pos="720"/>
+        </w:tabs>
+        <w:ind w:left="720" w:hanging="360"/>
+      </w:pPr>
+      <w:rPr>
+        <w:rFonts w:ascii="Symbol" w:hAnsi="Symbol" w:hint="default"/>
+        <w:sz w:val="20"/>
+      </w:rPr>
+    </w:lvl>
+    <w:lvl w:ilvl="1" w:tentative="1">
+      <w:start w:val="1"/>
+      <w:numFmt w:val="bullet"/>
+      <w:lvlText w:val="o"/>
+      <w:lvlJc w:val="left"/>
+      <w:pPr>
+        <w:tabs>
+          <w:tab w:val="num" w:pos="1440"/>
+        </w:tabs>
+        <w:ind w:left="1440" w:hanging="360"/>
+      </w:pPr>
+      <w:rPr>
+        <w:rFonts w:ascii="Courier New" w:hAnsi="Courier New" w:hint="default"/>
+        <w:sz w:val="20"/>
+      </w:rPr>
+    </w:lvl>
+    <w:lvl w:ilvl="2" w:tentative="1">
+      <w:start w:val="1"/>
+      <w:numFmt w:val="bullet"/>
+      <w:lvlText w:val=""/>
+      <w:lvlJc w:val="left"/>
+      <w:pPr>
+        <w:tabs>
+          <w:tab w:val="num" w:pos="2160"/>
+        </w:tabs>
+        <w:ind w:left="2160" w:hanging="360"/>
+      </w:pPr>
+      <w:rPr>
+        <w:rFonts w:ascii="Wingdings" w:hAnsi="Wingdings" w:hint="default"/>
+        <w:sz w:val="20"/>
+      </w:rPr>
+    </w:lvl>
+    <w:lvl w:ilvl="3" w:tentative="1">
+      <w:start w:val="1"/>
+      <w:numFmt w:val="bullet"/>
+      <w:lvlText w:val=""/>
+      <w:lvlJc w:val="left"/>
+      <w:pPr>
+        <w:tabs>
+          <w:tab w:val="num" w:pos="2880"/>
+        </w:tabs>
+        <w:ind w:left="2880" w:hanging="360"/>
+      </w:pPr>
+      <w:rPr>
+        <w:rFonts w:ascii="Wingdings" w:hAnsi="Wingdings" w:hint="default"/>
+        <w:sz w:val="20"/>
+      </w:rPr>
+    </w:lvl>
+    <w:lvl w:ilvl="4" w:tentative="1">
+      <w:start w:val="1"/>
+      <w:numFmt w:val="bullet"/>
+      <w:lvlText w:val=""/>
+      <w:lvlJc w:val="left"/>
+      <w:pPr>
+        <w:tabs>
+          <w:tab w:val="num" w:pos="3600"/>
+        </w:tabs>
+        <w:ind w:left="3600" w:hanging="360"/>
+      </w:pPr>
+      <w:rPr>
+        <w:rFonts w:ascii="Wingdings" w:hAnsi="Wingdings" w:hint="default"/>
+        <w:sz w:val="20"/>
+      </w:rPr>
+    </w:lvl>
+    <w:lvl w:ilvl="5" w:tentative="1">
+      <w:start w:val="1"/>
+      <w:numFmt w:val="bullet"/>
+      <w:lvlText w:val=""/>
+      <w:lvlJc w:val="left"/>
+      <w:pPr>
+        <w:tabs>
+          <w:tab w:val="num" w:pos="4320"/>
+        </w:tabs>
+        <w:ind w:left="4320" w:hanging="360"/>
+      </w:pPr>
+      <w:rPr>
+        <w:rFonts w:ascii="Wingdings" w:hAnsi="Wingdings" w:hint="default"/>
+        <w:sz w:val="20"/>
+      </w:rPr>
+    </w:lvl>
+    <w:lvl w:ilvl="6" w:tentative="1">
+      <w:start w:val="1"/>
+      <w:numFmt w:val="bullet"/>
+      <w:lvlText w:val=""/>
+      <w:lvlJc w:val="left"/>
+      <w:pPr>
+        <w:tabs>
+          <w:tab w:val="num" w:pos="5040"/>
+        </w:tabs>
+        <w:ind w:left="5040" w:hanging="360"/>
+      </w:pPr>
+      <w:rPr>
+        <w:rFonts w:ascii="Wingdings" w:hAnsi="Wingdings" w:hint="default"/>
+        <w:sz w:val="20"/>
+      </w:rPr>
+    </w:lvl>
+    <w:lvl w:ilvl="7" w:tentative="1">
+      <w:start w:val="1"/>
+      <w:numFmt w:val="bullet"/>
+      <w:lvlText w:val=""/>
+      <w:lvlJc w:val="left"/>
+      <w:pPr>
+        <w:tabs>
+          <w:tab w:val="num" w:pos="5760"/>
+        </w:tabs>
+        <w:ind w:left="5760" w:hanging="360"/>
+      </w:pPr>
+      <w:rPr>
+        <w:rFonts w:ascii="Wingdings" w:hAnsi="Wingdings" w:hint="default"/>
+        <w:sz w:val="20"/>
+      </w:rPr>
+    </w:lvl>
+    <w:lvl w:ilvl="8" w:tentative="1">
+      <w:start w:val="1"/>
+      <w:numFmt w:val="bullet"/>
+      <w:lvlText w:val=""/>
+      <w:lvlJc w:val="left"/>
+      <w:pPr>
+        <w:tabs>
+          <w:tab w:val="num" w:pos="6480"/>
+        </w:tabs>
+        <w:ind w:left="6480" w:hanging="360"/>
+      </w:pPr>
+      <w:rPr>
+        <w:rFonts w:ascii="Wingdings" w:hAnsi="Wingdings" w:hint="default"/>
+        <w:sz w:val="20"/>
+      </w:rPr>
+    </w:lvl>
+  </w:abstractNum>
+  <w:abstractNum w:abstractNumId="16" w15:restartNumberingAfterBreak="0">
     <w:nsid w:val="7B02499D"/>
     <w:multiLevelType w:val="hybridMultilevel"/>
     <w:tmpl w:val="30E674B6"/>
@@ -8392,7 +9189,7 @@
       </w:pPr>
     </w:lvl>
   </w:abstractNum>
-  <w:abstractNum w:abstractNumId="13" w15:restartNumberingAfterBreak="0">
+  <w:abstractNum w:abstractNumId="17" w15:restartNumberingAfterBreak="0">
     <w:nsid w:val="7B7A4C78"/>
     <w:multiLevelType w:val="multilevel"/>
     <w:tmpl w:val="D264E08C"/>
@@ -8542,7 +9339,7 @@
     </w:lvl>
   </w:abstractNum>
   <w:num w:numId="1" w16cid:durableId="1524202000">
-    <w:abstractNumId w:val="9"/>
+    <w:abstractNumId w:val="12"/>
   </w:num>
   <w:num w:numId="2" w16cid:durableId="146557319">
     <w:abstractNumId w:val="3"/>
@@ -8551,37 +9348,49 @@
     <w:abstractNumId w:val="0"/>
   </w:num>
   <w:num w:numId="4" w16cid:durableId="1508137107">
-    <w:abstractNumId w:val="8"/>
+    <w:abstractNumId w:val="11"/>
   </w:num>
   <w:num w:numId="5" w16cid:durableId="1534224815">
-    <w:abstractNumId w:val="5"/>
+    <w:abstractNumId w:val="8"/>
   </w:num>
   <w:num w:numId="6" w16cid:durableId="727999587">
     <w:abstractNumId w:val="4"/>
   </w:num>
   <w:num w:numId="7" w16cid:durableId="250086959">
-    <w:abstractNumId w:val="13"/>
+    <w:abstractNumId w:val="17"/>
   </w:num>
   <w:num w:numId="8" w16cid:durableId="400366779">
-    <w:abstractNumId w:val="11"/>
+    <w:abstractNumId w:val="14"/>
   </w:num>
   <w:num w:numId="9" w16cid:durableId="1359893903">
-    <w:abstractNumId w:val="10"/>
+    <w:abstractNumId w:val="13"/>
   </w:num>
   <w:num w:numId="10" w16cid:durableId="1727026266">
     <w:abstractNumId w:val="2"/>
   </w:num>
   <w:num w:numId="11" w16cid:durableId="526719362">
-    <w:abstractNumId w:val="6"/>
+    <w:abstractNumId w:val="9"/>
   </w:num>
   <w:num w:numId="12" w16cid:durableId="68817628">
-    <w:abstractNumId w:val="7"/>
+    <w:abstractNumId w:val="10"/>
   </w:num>
   <w:num w:numId="13" w16cid:durableId="456722028">
-    <w:abstractNumId w:val="12"/>
+    <w:abstractNumId w:val="16"/>
   </w:num>
   <w:num w:numId="14" w16cid:durableId="1744640092">
     <w:abstractNumId w:val="1"/>
+  </w:num>
+  <w:num w:numId="15" w16cid:durableId="2031836470">
+    <w:abstractNumId w:val="15"/>
+  </w:num>
+  <w:num w:numId="16" w16cid:durableId="569315912">
+    <w:abstractNumId w:val="6"/>
+  </w:num>
+  <w:num w:numId="17" w16cid:durableId="1748769367">
+    <w:abstractNumId w:val="5"/>
+  </w:num>
+  <w:num w:numId="18" w16cid:durableId="114570245">
+    <w:abstractNumId w:val="7"/>
   </w:num>
 </w:numbering>
 </file>
@@ -9190,7 +9999,6 @@
   <w:style w:type="character" w:default="1" w:styleId="DefaultParagraphFont">
     <w:name w:val="Default Paragraph Font"/>
     <w:uiPriority w:val="1"/>
-    <w:semiHidden/>
     <w:unhideWhenUsed/>
   </w:style>
   <w:style w:type="table" w:default="1" w:styleId="TableNormal">

</xml_diff>